<commit_message>
feat: refactor into modular monolith architecture with domain-specific submodules and core utilities
</commit_message>
<xml_diff>
--- a/docs/capstone/chapters/full chapters.md.docx
+++ b/docs/capstone/chapters/full chapters.md.docx
@@ -4,28 +4,353 @@
   <w:body>
     <w:p>
       <w:pPr>
+        <w:rPr>
+          <w:sz w:val="28"/>
+          <w:szCs w:val="28"/>
+        </w:rPr>
+      </w:pPr>
+      <w:r>
+        <w:rPr>
+          <w:noProof/>
+        </w:rPr>
+        <w:drawing>
+          <wp:anchor distT="0" distB="0" distL="114300" distR="114300" simplePos="0" relativeHeight="251661312" behindDoc="0" locked="0" layoutInCell="1" allowOverlap="1" wp14:anchorId="46AD3C45" wp14:editId="3FA99661">
+            <wp:simplePos x="0" y="0"/>
+            <wp:positionH relativeFrom="column">
+              <wp:posOffset>163773</wp:posOffset>
+            </wp:positionH>
+            <wp:positionV relativeFrom="paragraph">
+              <wp:posOffset>-662864</wp:posOffset>
+            </wp:positionV>
+            <wp:extent cx="5943600" cy="1049020"/>
+            <wp:effectExtent l="0" t="0" r="0" b="0"/>
+            <wp:wrapNone/>
+            <wp:docPr id="1611021991" name="Picture 1"/>
+            <wp:cNvGraphicFramePr>
+              <a:graphicFrameLocks xmlns:a="http://schemas.openxmlformats.org/drawingml/2006/main" noChangeAspect="1"/>
+            </wp:cNvGraphicFramePr>
+            <a:graphic xmlns:a="http://schemas.openxmlformats.org/drawingml/2006/main">
+              <a:graphicData uri="http://schemas.openxmlformats.org/drawingml/2006/picture">
+                <pic:pic xmlns:pic="http://schemas.openxmlformats.org/drawingml/2006/picture">
+                  <pic:nvPicPr>
+                    <pic:cNvPr id="0" name="Picture 1"/>
+                    <pic:cNvPicPr>
+                      <a:picLocks noChangeAspect="1" noChangeArrowheads="1"/>
+                    </pic:cNvPicPr>
+                  </pic:nvPicPr>
+                  <pic:blipFill>
+                    <a:blip r:embed="rId8" cstate="print">
+                      <a:extLst>
+                        <a:ext uri="{28A0092B-C50C-407E-A947-70E740481C1C}">
+                          <a14:useLocalDpi xmlns:a14="http://schemas.microsoft.com/office/drawing/2010/main" val="0"/>
+                        </a:ext>
+                      </a:extLst>
+                    </a:blip>
+                    <a:srcRect/>
+                    <a:stretch>
+                      <a:fillRect/>
+                    </a:stretch>
+                  </pic:blipFill>
+                  <pic:spPr bwMode="auto">
+                    <a:xfrm>
+                      <a:off x="0" y="0"/>
+                      <a:ext cx="5943600" cy="1049020"/>
+                    </a:xfrm>
+                    <a:prstGeom prst="rect">
+                      <a:avLst/>
+                    </a:prstGeom>
+                    <a:noFill/>
+                    <a:ln>
+                      <a:noFill/>
+                    </a:ln>
+                  </pic:spPr>
+                </pic:pic>
+              </a:graphicData>
+            </a:graphic>
+            <wp14:sizeRelH relativeFrom="page">
+              <wp14:pctWidth>0</wp14:pctWidth>
+            </wp14:sizeRelH>
+            <wp14:sizeRelV relativeFrom="page">
+              <wp14:pctHeight>0</wp14:pctHeight>
+            </wp14:sizeRelV>
+          </wp:anchor>
+        </w:drawing>
+      </w:r>
+    </w:p>
+    <w:p>
+      <w:pPr>
+        <w:rPr>
+          <w:sz w:val="28"/>
+          <w:szCs w:val="28"/>
+        </w:rPr>
+      </w:pPr>
+    </w:p>
+    <w:p>
+      <w:pPr>
+        <w:rPr>
+          <w:sz w:val="28"/>
+          <w:szCs w:val="28"/>
+        </w:rPr>
+      </w:pPr>
+    </w:p>
+    <w:p>
+      <w:pPr>
+        <w:rPr>
+          <w:sz w:val="28"/>
+          <w:szCs w:val="28"/>
+        </w:rPr>
+      </w:pPr>
+    </w:p>
+    <w:p>
+      <w:pPr>
+        <w:jc w:val="center"/>
+        <w:rPr>
+          <w:sz w:val="40"/>
+          <w:szCs w:val="40"/>
+        </w:rPr>
+      </w:pPr>
+    </w:p>
+    <w:p>
+      <w:pPr>
+        <w:jc w:val="center"/>
+        <w:rPr>
+          <w:b/>
+          <w:bCs/>
+          <w:sz w:val="40"/>
+          <w:szCs w:val="40"/>
+        </w:rPr>
+      </w:pPr>
+      <w:r>
+        <w:rPr>
+          <w:b/>
+          <w:bCs/>
+          <w:sz w:val="40"/>
+          <w:szCs w:val="40"/>
+        </w:rPr>
+        <w:t xml:space="preserve">Interactive Digital Cultural Map and Local Tourism Information System for </w:t>
+      </w:r>
+      <w:proofErr w:type="spellStart"/>
+      <w:r>
+        <w:rPr>
+          <w:b/>
+          <w:bCs/>
+          <w:sz w:val="40"/>
+          <w:szCs w:val="40"/>
+        </w:rPr>
+        <w:t>Mangatarem</w:t>
+      </w:r>
+      <w:proofErr w:type="spellEnd"/>
+      <w:r>
+        <w:rPr>
+          <w:b/>
+          <w:bCs/>
+          <w:sz w:val="40"/>
+          <w:szCs w:val="40"/>
+        </w:rPr>
+        <w:t>, Pangasinan</w:t>
+      </w:r>
+    </w:p>
+    <w:p>
+      <w:pPr>
+        <w:jc w:val="center"/>
+        <w:rPr>
+          <w:b/>
+          <w:bCs/>
+          <w:sz w:val="40"/>
+          <w:szCs w:val="40"/>
+        </w:rPr>
+      </w:pPr>
+    </w:p>
+    <w:p>
+      <w:pPr>
+        <w:jc w:val="center"/>
+        <w:rPr>
+          <w:b/>
+          <w:bCs/>
+          <w:sz w:val="40"/>
+          <w:szCs w:val="40"/>
+        </w:rPr>
+      </w:pPr>
+    </w:p>
+    <w:p>
+      <w:pPr>
+        <w:jc w:val="center"/>
+        <w:rPr>
+          <w:b/>
+          <w:bCs/>
+          <w:sz w:val="40"/>
+          <w:szCs w:val="40"/>
+        </w:rPr>
+      </w:pPr>
+    </w:p>
+    <w:p>
+      <w:pPr>
+        <w:jc w:val="center"/>
+        <w:rPr>
+          <w:sz w:val="40"/>
+          <w:szCs w:val="40"/>
+        </w:rPr>
+      </w:pPr>
+    </w:p>
+    <w:p>
+      <w:pPr>
+        <w:jc w:val="center"/>
+        <w:rPr>
+          <w:sz w:val="28"/>
+          <w:szCs w:val="28"/>
+        </w:rPr>
+      </w:pPr>
+    </w:p>
+    <w:p>
+      <w:pPr>
+        <w:jc w:val="center"/>
+        <w:rPr>
+          <w:sz w:val="28"/>
+          <w:szCs w:val="28"/>
+        </w:rPr>
+      </w:pPr>
+    </w:p>
+    <w:p>
+      <w:pPr>
+        <w:jc w:val="center"/>
+        <w:rPr>
+          <w:sz w:val="28"/>
+          <w:szCs w:val="28"/>
+        </w:rPr>
+      </w:pPr>
+      <w:r>
+        <w:rPr>
+          <w:sz w:val="28"/>
+          <w:szCs w:val="28"/>
+        </w:rPr>
+        <w:t>Submitted by:</w:t>
+      </w:r>
+    </w:p>
+    <w:p>
+      <w:pPr>
+        <w:jc w:val="center"/>
+        <w:rPr>
+          <w:sz w:val="28"/>
+          <w:szCs w:val="28"/>
+        </w:rPr>
+      </w:pPr>
+      <w:r>
+        <w:rPr>
+          <w:sz w:val="28"/>
+          <w:szCs w:val="28"/>
+        </w:rPr>
+        <w:t>Jem Carlo Austria</w:t>
+      </w:r>
+    </w:p>
+    <w:p>
+      <w:pPr>
+        <w:jc w:val="center"/>
+        <w:rPr>
+          <w:sz w:val="28"/>
+          <w:szCs w:val="28"/>
+        </w:rPr>
+      </w:pPr>
+      <w:r>
+        <w:rPr>
+          <w:sz w:val="28"/>
+          <w:szCs w:val="28"/>
+        </w:rPr>
+        <w:t>Mary Jane Dalas</w:t>
+      </w:r>
+    </w:p>
+    <w:p>
+      <w:pPr>
+        <w:jc w:val="center"/>
+        <w:rPr>
+          <w:sz w:val="28"/>
+          <w:szCs w:val="28"/>
+        </w:rPr>
+      </w:pPr>
+      <w:r>
+        <w:rPr>
+          <w:sz w:val="28"/>
+          <w:szCs w:val="28"/>
+        </w:rPr>
+        <w:t>Rea Solis</w:t>
+      </w:r>
+    </w:p>
+    <w:p>
+      <w:pPr>
+        <w:jc w:val="center"/>
+        <w:rPr>
+          <w:sz w:val="28"/>
+          <w:szCs w:val="28"/>
+        </w:rPr>
+      </w:pPr>
+      <w:r>
+        <w:rPr>
+          <w:sz w:val="28"/>
+          <w:szCs w:val="28"/>
+        </w:rPr>
+        <w:t>Joy De Guzman</w:t>
+      </w:r>
+    </w:p>
+    <w:p>
+      <w:pPr>
+        <w:jc w:val="center"/>
+        <w:rPr>
+          <w:sz w:val="28"/>
+          <w:szCs w:val="28"/>
+        </w:rPr>
+      </w:pPr>
+    </w:p>
+    <w:p>
+      <w:pPr>
+        <w:jc w:val="center"/>
+        <w:rPr>
+          <w:sz w:val="28"/>
+          <w:szCs w:val="28"/>
+        </w:rPr>
+      </w:pPr>
+    </w:p>
+    <w:p>
+      <w:pPr>
+        <w:jc w:val="center"/>
+        <w:rPr>
+          <w:sz w:val="28"/>
+          <w:szCs w:val="28"/>
+        </w:rPr>
+      </w:pPr>
+      <w:r>
+        <w:rPr>
+          <w:sz w:val="28"/>
+          <w:szCs w:val="28"/>
+        </w:rPr>
+        <w:t>Team B3</w:t>
+      </w:r>
+    </w:p>
+    <w:p>
+      <w:pPr>
         <w:pStyle w:val="Heading1"/>
       </w:pPr>
-      <w:bookmarkStart w:id="0" w:name="_3hc3l8f40i7l" w:colFirst="0" w:colLast="0"/>
+    </w:p>
+    <w:p>
+      <w:pPr>
+        <w:pStyle w:val="Heading1"/>
+      </w:pPr>
+    </w:p>
+    <w:p>
+      <w:pPr>
+        <w:pStyle w:val="Heading1"/>
+      </w:pPr>
+      <w:r>
+        <w:t>Chapter 1: Introduction</w:t>
+      </w:r>
+    </w:p>
+    <w:p>
+      <w:pPr>
+        <w:pStyle w:val="Heading2"/>
+      </w:pPr>
+      <w:bookmarkStart w:id="0" w:name="_rd9a4k1iaczq" w:colFirst="0" w:colLast="0"/>
       <w:bookmarkEnd w:id="0"/>
       <w:r>
-        <w:t>Chapter 1: Introduction</w:t>
-      </w:r>
-    </w:p>
-    <w:p>
-      <w:pPr>
-        <w:pStyle w:val="Heading2"/>
-      </w:pPr>
-      <w:bookmarkStart w:id="1" w:name="_rd9a4k1iaczq" w:colFirst="0" w:colLast="0"/>
-      <w:bookmarkEnd w:id="1"/>
-      <w:r>
-        <w:t xml:space="preserve">Background of </w:t>
-      </w:r>
-      <w:proofErr w:type="gramStart"/>
-      <w:r>
-        <w:t>the Study</w:t>
-      </w:r>
-      <w:proofErr w:type="gramEnd"/>
+        <w:t>Background of the Study</w:t>
+      </w:r>
     </w:p>
     <w:p>
       <w:r>
@@ -63,15 +388,18 @@
     </w:p>
     <w:p>
       <w:r>
-        <w:t xml:space="preserve">Moving to a digital setup involves a mix of leadership, community habits, and technical skills. We see this as a complex process that connects a town's past with its future (Reyes, 2024; Smith, 2023). Experts often call this shift an impactful phenomenon where the way people experience local heritage is dramatically changed (Cruz, 2022). We want to explore these factors more deeply to help you build a system that </w:t>
-      </w:r>
-      <w:proofErr w:type="gramStart"/>
-      <w:r>
-        <w:t>actually lasts</w:t>
-      </w:r>
-      <w:proofErr w:type="gramEnd"/>
-      <w:r>
-        <w:t>.</w:t>
+        <w:t xml:space="preserve">Moving to a digital setup involves a mix of leadership, community habits, and technical skills. </w:t>
+      </w:r>
+      <w:proofErr w:type="spellStart"/>
+      <w:r>
+        <w:t>inp</w:t>
+      </w:r>
+      <w:r>
+        <w:t>We</w:t>
+      </w:r>
+      <w:proofErr w:type="spellEnd"/>
+      <w:r>
+        <w:t xml:space="preserve"> see this as a complex process that connects a town's past with its future (Reyes, 2024; Smith, 2023). Experts often call this shift an impactful phenomenon where the way people experience local heritage is dramatically changed (Cruz, 2022). We want to explore these factors more deeply to help you build a system that actually lasts.</w:t>
       </w:r>
     </w:p>
     <w:p>
@@ -129,23 +457,7 @@
     </w:p>
     <w:p>
       <w:r>
-        <w:t xml:space="preserve">The LGU is the perfect spot for our study because the tourism office acts as the main hub for </w:t>
-      </w:r>
-      <w:proofErr w:type="gramStart"/>
-      <w:r>
-        <w:t>every barangay’s unique traditions and data</w:t>
-      </w:r>
-      <w:proofErr w:type="gramEnd"/>
-      <w:r>
-        <w:t xml:space="preserve">. We found that this office provides a well-organized and professional environment where we can easily coordinate with officials to verify historical facts. By working directly in these municipal spaces, we can ensure the cultural data we collect is accurate and reflects the town's </w:t>
-      </w:r>
-      <w:proofErr w:type="gramStart"/>
-      <w:r>
-        <w:t>true identity</w:t>
-      </w:r>
-      <w:proofErr w:type="gramEnd"/>
-      <w:r>
-        <w:t>. We've designed this process to take those old physical files and turn them into digital maps and searchable databases that you can access easily.</w:t>
+        <w:t>The LGU is the perfect spot for our study because the tourism office acts as the main hub for every barangay’s unique traditions and data. We found that this office provides a well-organized and professional environment where we can easily coordinate with officials to verify historical facts. By working directly in these municipal spaces, we can ensure the cultural data we collect is accurate and reflects the town's true identity. We've designed this process to take those old physical files and turn them into digital maps and searchable databases that you can access easily.</w:t>
       </w:r>
     </w:p>
     <w:p>
@@ -162,25 +474,17 @@
     </w:p>
     <w:p>
       <w:r>
-        <w:t xml:space="preserve">Moving to a digital system isn't just a simple technical update; it's a vital change that connects a town's past with its future (Reyes, 2024; Smith, 2023). Experts often see this transition as an impactful phenomenon where the way people experience local heritage is dramatically changed (Cruz, 2022). We're exploring these factors to make sure the town's cultural assets are preserved for a much wider audience. And since the LGU is the primary decision-maker, our goal is to provide them with a system that </w:t>
-      </w:r>
-      <w:proofErr w:type="gramStart"/>
-      <w:r>
-        <w:t>actually works</w:t>
-      </w:r>
-      <w:proofErr w:type="gramEnd"/>
-      <w:r>
-        <w:t xml:space="preserve"> for the long term.</w:t>
+        <w:lastRenderedPageBreak/>
+        <w:t>Moving to a digital system isn't just a simple technical update; it's a vital change that connects a town's past with its future (Reyes, 2024; Smith, 2023). Experts often see this transition as an impactful phenomenon where the way people experience local heritage is dramatically changed (Cruz, 2022). We're exploring these factors to make sure the town's cultural assets are preserved for a much wider audience. And since the LGU is the primary decision-maker, our goal is to provide them with a system that actually works for the long term.</w:t>
       </w:r>
     </w:p>
     <w:p>
       <w:pPr>
         <w:pStyle w:val="Heading3"/>
       </w:pPr>
-      <w:bookmarkStart w:id="2" w:name="_ef7r3ubks8qs" w:colFirst="0" w:colLast="0"/>
-      <w:bookmarkEnd w:id="2"/>
-      <w:r>
-        <w:lastRenderedPageBreak/>
+      <w:bookmarkStart w:id="1" w:name="_ef7r3ubks8qs" w:colFirst="0" w:colLast="0"/>
+      <w:bookmarkEnd w:id="1"/>
+      <w:r>
         <w:t>Encountered Problems</w:t>
       </w:r>
     </w:p>
@@ -219,15 +523,7 @@
       </w:r>
       <w:proofErr w:type="spellEnd"/>
       <w:r>
-        <w:t xml:space="preserve">, Pangasinan." We designed this system to replace those slow, manual chores with a single web-based platform. Our goal is to make sure every </w:t>
-      </w:r>
-      <w:proofErr w:type="gramStart"/>
-      <w:r>
-        <w:t>tourist</w:t>
-      </w:r>
-      <w:proofErr w:type="gramEnd"/>
-      <w:r>
-        <w:t xml:space="preserve"> and resident can find the same accurate information in one place. By putting cultural maps and town data online, we can help the LGU work faster and keep their records consistent. Experts often call this move to digital tools an impactful phenomenon that changes how people connect with their heritage (Cruz, 2022). We want to give the town a reliable tool that makes </w:t>
+        <w:t xml:space="preserve">, Pangasinan." We designed this system to replace those slow, manual chores with a single web-based platform. Our goal is to make sure every tourist and resident can find the same accurate information in one place. By putting cultural maps and town data online, we can help the LGU work faster and keep their records consistent. Experts often call this move to digital tools an impactful phenomenon that changes how people connect with their heritage (Cruz, 2022). We want to give the town a reliable tool that makes </w:t>
       </w:r>
       <w:proofErr w:type="spellStart"/>
       <w:r>
@@ -242,23 +538,15 @@
       <w:pPr>
         <w:pStyle w:val="Heading2"/>
       </w:pPr>
-      <w:bookmarkStart w:id="3" w:name="_i0e6dxsplbuo" w:colFirst="0" w:colLast="0"/>
-      <w:bookmarkEnd w:id="3"/>
+      <w:bookmarkStart w:id="2" w:name="_i0e6dxsplbuo" w:colFirst="0" w:colLast="0"/>
+      <w:bookmarkEnd w:id="2"/>
       <w:r>
         <w:t>Purpose and Description</w:t>
       </w:r>
     </w:p>
     <w:p>
       <w:r>
-        <w:t xml:space="preserve">This Capstone Project was conducted </w:t>
-      </w:r>
-      <w:proofErr w:type="gramStart"/>
-      <w:r>
-        <w:t>in order to</w:t>
-      </w:r>
-      <w:proofErr w:type="gramEnd"/>
-      <w:r>
-        <w:t xml:space="preserve"> centralize and digitize the tourism and cultural information of </w:t>
+        <w:t xml:space="preserve">This Capstone Project was conducted in order to centralize and digitize the tourism and cultural information of </w:t>
       </w:r>
       <w:proofErr w:type="spellStart"/>
       <w:r>
@@ -266,15 +554,7 @@
       </w:r>
       <w:proofErr w:type="spellEnd"/>
       <w:r>
-        <w:t xml:space="preserve">, Pangasinan. We want to provide an easy, interactive platform that cleans up the way data is managed while making the town’s </w:t>
-      </w:r>
-      <w:proofErr w:type="gramStart"/>
-      <w:r>
-        <w:t>heritage</w:t>
-      </w:r>
-      <w:proofErr w:type="gramEnd"/>
-      <w:r>
-        <w:t xml:space="preserve"> easy for everyone to find.</w:t>
+        <w:t>, Pangasinan. We want to provide an easy, interactive platform that cleans up the way data is managed while making the town’s heritage easy for everyone to find.</w:t>
       </w:r>
     </w:p>
     <w:p>
@@ -337,7 +617,11 @@
         <w:t>Administrative and Stakeholder Users (LGU Tourism Office and Barangay Representatives)</w:t>
       </w:r>
       <w:r>
-        <w:t xml:space="preserve"> – This category is the primary beneficiary, as it provides a centralized platform for the LGU to promote tourism and manage cultural data. It allows the Tourism Office staff to verify facts from every barangay, ensuring the public receives accurate and authoritative information. Barangay representatives benefit from a dedicated portal to directly upload content, streamlining the flow of information from the grassroots level to the municipal dashboard.</w:t>
+        <w:t xml:space="preserve"> – This category is the primary beneficiary, as it provides a centralized platform for the LGU to promote tourism and manage cultural data. It allows the Tourism Office staff to verify facts from every barangay, ensuring the public receives accurate and authoritative information. Barangay representatives benefit from a dedicated portal </w:t>
+      </w:r>
+      <w:r>
+        <w:lastRenderedPageBreak/>
+        <w:t>to directly upload content, streamlining the flow of information from the grassroots level to the municipal dashboard.</w:t>
       </w:r>
     </w:p>
     <w:p>
@@ -416,8 +700,8 @@
       <w:pPr>
         <w:pStyle w:val="Heading2"/>
       </w:pPr>
-      <w:bookmarkStart w:id="4" w:name="_965qi2lia4xi" w:colFirst="0" w:colLast="0"/>
-      <w:bookmarkEnd w:id="4"/>
+      <w:bookmarkStart w:id="3" w:name="_965qi2lia4xi" w:colFirst="0" w:colLast="0"/>
+      <w:bookmarkEnd w:id="3"/>
       <w:r>
         <w:rPr>
           <w:b/>
@@ -538,15 +822,19 @@
       <w:pPr>
         <w:pStyle w:val="Heading2"/>
       </w:pPr>
-      <w:bookmarkStart w:id="5" w:name="_h5xmcydi1he5" w:colFirst="0" w:colLast="0"/>
-      <w:bookmarkEnd w:id="5"/>
+      <w:bookmarkStart w:id="4" w:name="_h5xmcydi1he5" w:colFirst="0" w:colLast="0"/>
+      <w:bookmarkEnd w:id="4"/>
       <w:r>
         <w:t>Conceptual Framework</w:t>
       </w:r>
     </w:p>
     <w:p>
       <w:r>
-        <w:t>We're using the Input-Process-Output (IPO) model to map out exactly how we'll build this system from the ground up. It’s a simple way to show the raw ingredients we need, the steps we'll take to build the code, and the final platform we'll deliver to the town. Think of it as a roadmap that connects our technical tools with the actual work of creating the cultural map. By following this model, we can make sure every piece of the project fits together and solves the real problems the LGU is facing.</w:t>
+        <w:t xml:space="preserve">We're using the Input-Process-Output (IPO) model to map out exactly how we'll build this system from the ground up. It’s a simple way to show the raw ingredients we need, the steps </w:t>
+      </w:r>
+      <w:r>
+        <w:lastRenderedPageBreak/>
+        <w:t>we'll take to build the code, and the final platform we'll deliver to the town. Think of it as a roadmap that connects our technical tools with the actual work of creating the cultural map. By following this model, we can make sure every piece of the project fits together and solves the real problems the LGU is facing.</w:t>
       </w:r>
     </w:p>
     <w:p>
@@ -562,27 +850,6 @@
       </w:pPr>
     </w:p>
     <w:p>
-      <w:r>
-        <w:t xml:space="preserve">Input Knowledge Requirements: We need to know our way around web tools like HTML, CSS, JavaScript, and Python. We also need to understand how PostgreSQL handles data. It's just as important for us to learn how the town currently handles its tourism information and what each </w:t>
-      </w:r>
-      <w:proofErr w:type="gramStart"/>
-      <w:r>
-        <w:t>person—</w:t>
-      </w:r>
-      <w:proofErr w:type="gramEnd"/>
-      <w:r>
-        <w:t xml:space="preserve">like a staff member or a </w:t>
-      </w:r>
-      <w:proofErr w:type="gramStart"/>
-      <w:r>
-        <w:t>visitor—actually needs</w:t>
-      </w:r>
-      <w:proofErr w:type="gramEnd"/>
-      <w:r>
-        <w:t xml:space="preserve"> from the map.</w:t>
-      </w:r>
-    </w:p>
-    <w:p>
       <w:pPr>
         <w:widowControl w:val="0"/>
         <w:pBdr>
@@ -595,11 +862,6 @@
       </w:pPr>
     </w:p>
     <w:p>
-      <w:r>
-        <w:t>Hardware Requirements: To keep our work running smoothly, we’re using computers with at least an Intel Core i5 or AMD Ryzen 5 processor. We’re also using 8GB to 16GB of RAM and a 500GB SSD to make sure the coding environment doesn't lag while we build the system.</w:t>
-      </w:r>
-    </w:p>
-    <w:p>
       <w:pPr>
         <w:widowControl w:val="0"/>
         <w:pBdr>
@@ -612,27 +874,6 @@
       </w:pPr>
     </w:p>
     <w:p>
-      <w:r>
-        <w:t xml:space="preserve">Software Requirements: We’ll do our coding in Visual Studio Code on Windows, Linux, or macOS. For the database, we’re using </w:t>
-      </w:r>
-      <w:proofErr w:type="spellStart"/>
-      <w:r>
-        <w:t>Supabase</w:t>
-      </w:r>
-      <w:proofErr w:type="spellEnd"/>
-      <w:r>
-        <w:t xml:space="preserve"> to host our PostgreSQL data, and we’ll launch the site on </w:t>
-      </w:r>
-      <w:proofErr w:type="spellStart"/>
-      <w:r>
-        <w:t>Vercel</w:t>
-      </w:r>
-      <w:proofErr w:type="spellEnd"/>
-      <w:r>
-        <w:t>. We’ll also use Figma to design the look and feel of the map before we write any code.</w:t>
-      </w:r>
-    </w:p>
-    <w:p>
       <w:pPr>
         <w:widowControl w:val="0"/>
         <w:pBdr>
@@ -645,11 +886,6 @@
       </w:pPr>
     </w:p>
     <w:p>
-      <w:r>
-        <w:t>Process Rapid Application Development (RAD) Methodology:</w:t>
-      </w:r>
-    </w:p>
-    <w:p>
       <w:pPr>
         <w:widowControl w:val="0"/>
         <w:pBdr>
@@ -662,29 +898,6 @@
       </w:pPr>
     </w:p>
     <w:p>
-      <w:r>
-        <w:t>Requirements Planning – We sit down and figure out what the LGU and visitors really need.</w:t>
-      </w:r>
-    </w:p>
-    <w:p/>
-    <w:p>
-      <w:r>
-        <w:t>User Design – We build prototypes and show them to people to see what works best.</w:t>
-      </w:r>
-    </w:p>
-    <w:p/>
-    <w:p>
-      <w:r>
-        <w:t>Construction – We write the code and build the actual features of the map in stages.</w:t>
-      </w:r>
-    </w:p>
-    <w:p/>
-    <w:p>
-      <w:r>
-        <w:t>Cutover – We do the final tests, launch the system, and train the staff on how to use it.</w:t>
-      </w:r>
-    </w:p>
-    <w:p>
       <w:pPr>
         <w:widowControl w:val="0"/>
         <w:pBdr>
@@ -697,19 +910,6 @@
       </w:pPr>
     </w:p>
     <w:p>
-      <w:r>
-        <w:t xml:space="preserve">Output The final product is the Interactive Digital Cultural Map and Local Tourism Information System for </w:t>
-      </w:r>
-      <w:proofErr w:type="spellStart"/>
-      <w:r>
-        <w:t>Mangatarem</w:t>
-      </w:r>
-      <w:proofErr w:type="spellEnd"/>
-      <w:r>
-        <w:t>, Pangasinan.</w:t>
-      </w:r>
-    </w:p>
-    <w:p>
       <w:pPr>
         <w:widowControl w:val="0"/>
         <w:pBdr>
@@ -722,11 +922,126 @@
       </w:pPr>
     </w:p>
     <w:p>
+      <w:pPr>
+        <w:widowControl w:val="0"/>
+        <w:pBdr>
+          <w:top w:val="nil"/>
+          <w:left w:val="nil"/>
+          <w:bottom w:val="nil"/>
+          <w:right w:val="nil"/>
+          <w:between w:val="nil"/>
+        </w:pBdr>
+      </w:pPr>
+      <w:r>
+        <w:rPr>
+          <w:noProof/>
+        </w:rPr>
+        <w:drawing>
+          <wp:anchor distT="0" distB="0" distL="114300" distR="114300" simplePos="0" relativeHeight="251658240" behindDoc="0" locked="0" layoutInCell="1" allowOverlap="1" wp14:anchorId="6FF62E82" wp14:editId="3CF417DA">
+            <wp:simplePos x="0" y="0"/>
+            <wp:positionH relativeFrom="column">
+              <wp:posOffset>13648</wp:posOffset>
+            </wp:positionH>
+            <wp:positionV relativeFrom="paragraph">
+              <wp:posOffset>182624</wp:posOffset>
+            </wp:positionV>
+            <wp:extent cx="5943600" cy="3874770"/>
+            <wp:effectExtent l="0" t="0" r="0" b="0"/>
+            <wp:wrapSquare wrapText="bothSides"/>
+            <wp:docPr id="1997711956" name="Picture 2"/>
+            <wp:cNvGraphicFramePr>
+              <a:graphicFrameLocks xmlns:a="http://schemas.openxmlformats.org/drawingml/2006/main" noChangeAspect="1"/>
+            </wp:cNvGraphicFramePr>
+            <a:graphic xmlns:a="http://schemas.openxmlformats.org/drawingml/2006/main">
+              <a:graphicData uri="http://schemas.openxmlformats.org/drawingml/2006/picture">
+                <pic:pic xmlns:pic="http://schemas.openxmlformats.org/drawingml/2006/picture">
+                  <pic:nvPicPr>
+                    <pic:cNvPr id="1997711956" name=""/>
+                    <pic:cNvPicPr/>
+                  </pic:nvPicPr>
+                  <pic:blipFill>
+                    <a:blip r:embed="rId9" cstate="print">
+                      <a:extLst>
+                        <a:ext uri="{28A0092B-C50C-407E-A947-70E740481C1C}">
+                          <a14:useLocalDpi xmlns:a14="http://schemas.microsoft.com/office/drawing/2010/main" val="0"/>
+                        </a:ext>
+                      </a:extLst>
+                    </a:blip>
+                    <a:stretch>
+                      <a:fillRect/>
+                    </a:stretch>
+                  </pic:blipFill>
+                  <pic:spPr>
+                    <a:xfrm>
+                      <a:off x="0" y="0"/>
+                      <a:ext cx="5943600" cy="3874770"/>
+                    </a:xfrm>
+                    <a:prstGeom prst="rect">
+                      <a:avLst/>
+                    </a:prstGeom>
+                  </pic:spPr>
+                </pic:pic>
+              </a:graphicData>
+            </a:graphic>
+          </wp:anchor>
+        </w:drawing>
+      </w:r>
+    </w:p>
+    <w:p>
+      <w:pPr>
+        <w:widowControl w:val="0"/>
+        <w:pBdr>
+          <w:top w:val="nil"/>
+          <w:left w:val="nil"/>
+          <w:bottom w:val="nil"/>
+          <w:right w:val="nil"/>
+          <w:between w:val="nil"/>
+        </w:pBdr>
+      </w:pPr>
+    </w:p>
+    <w:p>
+      <w:pPr>
+        <w:widowControl w:val="0"/>
+        <w:pBdr>
+          <w:top w:val="nil"/>
+          <w:left w:val="nil"/>
+          <w:bottom w:val="nil"/>
+          <w:right w:val="nil"/>
+          <w:between w:val="nil"/>
+        </w:pBdr>
+      </w:pPr>
+    </w:p>
+    <w:p>
+      <w:pPr>
+        <w:widowControl w:val="0"/>
+        <w:pBdr>
+          <w:top w:val="nil"/>
+          <w:left w:val="nil"/>
+          <w:bottom w:val="nil"/>
+          <w:right w:val="nil"/>
+          <w:between w:val="nil"/>
+        </w:pBdr>
+      </w:pPr>
+    </w:p>
+    <w:p>
+      <w:pPr>
+        <w:widowControl w:val="0"/>
+        <w:pBdr>
+          <w:top w:val="nil"/>
+          <w:left w:val="nil"/>
+          <w:bottom w:val="nil"/>
+          <w:right w:val="nil"/>
+          <w:between w:val="nil"/>
+        </w:pBdr>
+      </w:pPr>
+    </w:p>
+    <w:p>
       <w:r>
         <w:t xml:space="preserve">The conceptual framework illustrated above delineates the systematic flow of the project. The Inputs specify the technical and physical resources, along with the domain knowledge required by the developers to undertake the project. These resources feed into the Process, which employs the Rapid Application Development (RAD) methodology to iteratively design, prototype, and build the platform through structured phases. This structured process ensures that the final Output — the Interactive Digital Cultural Map and Local Tourism Information System — is developed efficiently and aligns with the functional and operational requirements of the </w:t>
       </w:r>
       <w:proofErr w:type="spellStart"/>
       <w:r>
+        <w:lastRenderedPageBreak/>
         <w:t>Mangatarem</w:t>
       </w:r>
       <w:proofErr w:type="spellEnd"/>
@@ -738,25 +1053,76 @@
       <w:pPr>
         <w:pStyle w:val="Heading2"/>
       </w:pPr>
-      <w:bookmarkStart w:id="6" w:name="_h1pqa33x9kzn" w:colFirst="0" w:colLast="0"/>
+      <w:bookmarkStart w:id="5" w:name="_h1pqa33x9kzn" w:colFirst="0" w:colLast="0"/>
+      <w:bookmarkEnd w:id="5"/>
+      <w:r>
+        <w:t>Scope and Limitations</w:t>
+      </w:r>
+    </w:p>
+    <w:p>
+      <w:pPr>
+        <w:pStyle w:val="Heading3"/>
+      </w:pPr>
+      <w:bookmarkStart w:id="6" w:name="_n3tki5nunsy9" w:colFirst="0" w:colLast="0"/>
       <w:bookmarkEnd w:id="6"/>
       <w:r>
-        <w:t>Scope and Limitations</w:t>
+        <w:t>Scope</w:t>
+      </w:r>
+    </w:p>
+    <w:p>
+      <w:r>
+        <w:t xml:space="preserve">The project focuses on the development of a web-based Interactive Digital Cultural Map and Local Tourism Information System for the Local Government Unit (LGU) of </w:t>
+      </w:r>
+      <w:proofErr w:type="spellStart"/>
+      <w:r>
+        <w:t>Mangatarem</w:t>
+      </w:r>
+      <w:proofErr w:type="spellEnd"/>
+      <w:r>
+        <w:t xml:space="preserve">, Pangasinan. The system will be built utilizing web technologies including HTML, CSS (Tailwind CSS), and JavaScript for the frontend interface, Python with the Flask framework for server-side application logic, and PostgreSQL as the primary relational database management system — managed via </w:t>
+      </w:r>
+      <w:proofErr w:type="spellStart"/>
+      <w:r>
+        <w:t>Supabase</w:t>
+      </w:r>
+      <w:proofErr w:type="spellEnd"/>
+      <w:r>
+        <w:t xml:space="preserve"> for cloud-native persistence and real-time features. Figma will be utilized for user interface and user experience design during the prototyping phase. The key functionalities provided by the software include a public-facing interactive map where the </w:t>
+      </w:r>
+      <w:r>
+        <w:rPr>
+          <w:b/>
+          <w:bCs/>
+        </w:rPr>
+        <w:t>Public and Academic</w:t>
+      </w:r>
+      <w:r>
+        <w:t xml:space="preserve"> category can browse, locate, and filter tourist attractions and cultural heritage sites by category such as historical landmarks, natural attractions, and local events. For </w:t>
+      </w:r>
+      <w:r>
+        <w:rPr>
+          <w:b/>
+          <w:bCs/>
+        </w:rPr>
+        <w:t>Administrative and Stakeholder</w:t>
+      </w:r>
+      <w:r>
+        <w:t xml:space="preserve"> users, the system features a decentralized content contribution portal that allows authorized Barangay Representatives to submit, upload, and propose updates for local tourism content, alongside a centralized administrative dashboard for LGU Tourism Office staff to moderate all submissions through an approve-or-reject workflow, manage user accounts, and publish municipal-wide tourism announcements. Students and researchers within the public category are provided with structured access to archived cultural profiles and historical records to support academic data gathering and heritage research.</w:t>
       </w:r>
     </w:p>
     <w:p>
       <w:pPr>
         <w:pStyle w:val="Heading3"/>
       </w:pPr>
-      <w:bookmarkStart w:id="7" w:name="_n3tki5nunsy9" w:colFirst="0" w:colLast="0"/>
+      <w:bookmarkStart w:id="7" w:name="_dke64jh0lci" w:colFirst="0" w:colLast="0"/>
       <w:bookmarkEnd w:id="7"/>
       <w:r>
-        <w:t>Scope</w:t>
-      </w:r>
-    </w:p>
-    <w:p>
-      <w:r>
-        <w:t xml:space="preserve">The project focuses on the development of a web-based Interactive Digital Cultural Map and Local Tourism Information System for the Local Government Unit (LGU) of </w:t>
+        <w:t>Limitations</w:t>
+      </w:r>
+    </w:p>
+    <w:p>
+      <w:r>
+        <w:t xml:space="preserve">While the system aims to provide comprehensive tourism information management for </w:t>
       </w:r>
       <w:proofErr w:type="spellStart"/>
       <w:r>
@@ -764,87 +1130,25 @@
       </w:r>
       <w:proofErr w:type="spellEnd"/>
       <w:r>
-        <w:t xml:space="preserve">, Pangasinan. The system will be built utilizing web technologies including HTML, CSS (Tailwind CSS), and JavaScript for the frontend interface, Python with the Flask framework for server-side application logic, and PostgreSQL as the primary relational database management system — managed via </w:t>
+        <w:t xml:space="preserve">, it will not include online booking, reservation, or payment gateway functionalities for local accommodations, tour guides, or event ticketing. The interactive map and all system features require an active internet connection; full offline capabilities such as cached map tiles or offline content browsing are not within the scope of this project. Performance and scalability are designed to accommodate the expected volume of tourist traffic and barangay-level content contributions typical of a municipal tourism platform, but the system is not engineered to handle extreme traffic surges beyond standard municipal usage without future server infrastructure upgrades. Access to the content contribution and moderation modules is strictly restricted to authenticated and authorized LGU personnel and registered Barangay Representatives, meaning the general public cannot directly create, edit, or publish map data without going through the LGU approval workflow. The system is also limited to the geographic and administrative boundaries of </w:t>
       </w:r>
       <w:proofErr w:type="spellStart"/>
       <w:r>
-        <w:t>Supabase</w:t>
+        <w:t>Mangatarem</w:t>
       </w:r>
       <w:proofErr w:type="spellEnd"/>
       <w:r>
-        <w:t xml:space="preserve"> for cloud-native persistence and real-time features. Figma will be </w:t>
-      </w:r>
+        <w:t>, Pangasinan, and does not cover tourism data from neighboring municipalities or provinces.</w:t>
+      </w:r>
+    </w:p>
+    <w:p>
+      <w:pPr>
+        <w:pStyle w:val="Heading2"/>
+      </w:pPr>
+      <w:bookmarkStart w:id="8" w:name="_83g9a2ekfjaj" w:colFirst="0" w:colLast="0"/>
+      <w:bookmarkEnd w:id="8"/>
       <w:r>
         <w:lastRenderedPageBreak/>
-        <w:t xml:space="preserve">utilized for user interface and user experience design during the prototyping phase. The key functionalities provided by the software include a public-facing interactive map where the </w:t>
-      </w:r>
-      <w:r>
-        <w:rPr>
-          <w:b/>
-          <w:bCs/>
-        </w:rPr>
-        <w:t>Public and Academic</w:t>
-      </w:r>
-      <w:r>
-        <w:t xml:space="preserve"> category can browse, locate, and filter tourist attractions and cultural heritage sites by category such as historical landmarks, natural attractions, and local events. For </w:t>
-      </w:r>
-      <w:r>
-        <w:rPr>
-          <w:b/>
-          <w:bCs/>
-        </w:rPr>
-        <w:t>Administrative and Stakeholder</w:t>
-      </w:r>
-      <w:r>
-        <w:t xml:space="preserve"> users, the system features a decentralized content contribution portal that allows authorized Barangay Representatives to submit, upload, and propose updates for local tourism content, alongside a centralized administrative dashboard for LGU Tourism Office staff to moderate all submissions through an approve-or-reject workflow, manage user accounts, and publish municipal-wide tourism announcements. Students and researchers within the public category are provided with structured access to archived cultural profiles and historical records to support academic data gathering and heritage research.</w:t>
-      </w:r>
-    </w:p>
-    <w:p>
-      <w:pPr>
-        <w:pStyle w:val="Heading3"/>
-      </w:pPr>
-      <w:bookmarkStart w:id="8" w:name="_dke64jh0lci" w:colFirst="0" w:colLast="0"/>
-      <w:bookmarkEnd w:id="8"/>
-      <w:r>
-        <w:t>Limitations</w:t>
-      </w:r>
-    </w:p>
-    <w:p>
-      <w:r>
-        <w:t xml:space="preserve">While the system aims to provide comprehensive tourism information management for </w:t>
-      </w:r>
-      <w:proofErr w:type="spellStart"/>
-      <w:r>
-        <w:t>Mangatarem</w:t>
-      </w:r>
-      <w:proofErr w:type="spellEnd"/>
-      <w:r>
-        <w:t xml:space="preserve">, it will not include online booking, reservation, or payment gateway functionalities for local accommodations, tour guides, or event ticketing. The interactive map and all system features require an active internet connection; full offline capabilities such as cached map tiles or offline content browsing are not within the scope of this project. Performance and scalability are designed to accommodate the expected volume of tourist traffic and barangay-level content contributions typical of a municipal tourism platform, but the system is not engineered to handle extreme traffic surges beyond standard municipal usage without future server infrastructure upgrades. Access to the content contribution and moderation modules is strictly restricted to authenticated and authorized LGU personnel and registered Barangay Representatives, meaning the </w:t>
-      </w:r>
-      <w:proofErr w:type="gramStart"/>
-      <w:r>
-        <w:t>general public</w:t>
-      </w:r>
-      <w:proofErr w:type="gramEnd"/>
-      <w:r>
-        <w:t xml:space="preserve"> cannot directly create, edit, or publish map data without going through the LGU approval workflow. The system is also limited to the geographic and administrative boundaries of </w:t>
-      </w:r>
-      <w:proofErr w:type="spellStart"/>
-      <w:r>
-        <w:t>Mangatarem</w:t>
-      </w:r>
-      <w:proofErr w:type="spellEnd"/>
-      <w:r>
-        <w:t>, Pangasinan, and does not cover tourism data from neighboring municipalities or provinces.</w:t>
-      </w:r>
-    </w:p>
-    <w:p>
-      <w:pPr>
-        <w:pStyle w:val="Heading2"/>
-      </w:pPr>
-      <w:bookmarkStart w:id="9" w:name="_83g9a2ekfjaj" w:colFirst="0" w:colLast="0"/>
-      <w:bookmarkEnd w:id="9"/>
-      <w:r>
         <w:t>Definition of Terms</w:t>
       </w:r>
     </w:p>
@@ -911,11 +1215,7 @@
         <w:t>General Public and Academic Users</w:t>
       </w:r>
       <w:r>
-        <w:t xml:space="preserve"> — This category refers to tourists, visitors, students, and researchers who access the system to navigate the interactive map, search for points of interest, and view published cultural and tourism information. These </w:t>
-      </w:r>
-      <w:r>
-        <w:lastRenderedPageBreak/>
-        <w:t>users consume the data for leisure, travel planning, or academic data gathering without requiring administrative privileges.</w:t>
+        <w:t xml:space="preserve"> — This category refers to tourists, visitors, students, and researchers who access the system to navigate the interactive map, search for points of interest, and view published cultural and tourism information. These users consume the data for leisure, travel planning, or academic data gathering without requiring administrative privileges.</w:t>
       </w:r>
     </w:p>
     <w:p>
@@ -982,22 +1282,10 @@
           <w:b/>
           <w:bCs/>
         </w:rPr>
-        <w:t>Local Government Unit (</w:t>
-      </w:r>
-      <w:proofErr w:type="gramStart"/>
-      <w:r>
-        <w:rPr>
-          <w:b/>
-          <w:bCs/>
-        </w:rPr>
-        <w:t>LGU)</w:t>
-      </w:r>
-      <w:r>
-        <w:t xml:space="preserve"> —</w:t>
-      </w:r>
-      <w:proofErr w:type="gramEnd"/>
-      <w:r>
-        <w:t xml:space="preserve"> In this study, this refers specifically to the municipal government of </w:t>
+        <w:t>Local Government Unit (LGU)</w:t>
+      </w:r>
+      <w:r>
+        <w:t xml:space="preserve"> — In this study, this refers specifically to the municipal government of </w:t>
       </w:r>
       <w:proofErr w:type="spellStart"/>
       <w:r>
@@ -1064,22 +1352,10 @@
           <w:b/>
           <w:bCs/>
         </w:rPr>
-        <w:t>Rapid Application Development (</w:t>
-      </w:r>
-      <w:proofErr w:type="gramStart"/>
-      <w:r>
-        <w:rPr>
-          <w:b/>
-          <w:bCs/>
-        </w:rPr>
-        <w:t>RAD)</w:t>
-      </w:r>
-      <w:r>
-        <w:t xml:space="preserve"> —</w:t>
-      </w:r>
-      <w:proofErr w:type="gramEnd"/>
-      <w:r>
-        <w:t xml:space="preserve"> The software development methodology selected for this study, characterized by rapid prototyping, iterative feedback cycles, flexible requirements gathering, and continuous stakeholder involvement to accelerate system construction while maintaining alignment with user needs.</w:t>
+        <w:t>Rapid Application Development (RAD)</w:t>
+      </w:r>
+      <w:r>
+        <w:t xml:space="preserve"> — The software development methodology selected for this study, characterized by rapid prototyping, iterative feedback cycles, flexible requirements gathering, and continuous stakeholder involvement to accelerate system construction while maintaining alignment with user needs.</w:t>
       </w:r>
     </w:p>
     <w:p>
@@ -1117,39 +1393,32 @@
       <w:pPr>
         <w:pStyle w:val="Heading2"/>
       </w:pPr>
-      <w:bookmarkStart w:id="10" w:name="_nax90coynxy8" w:colFirst="0" w:colLast="0"/>
+      <w:bookmarkStart w:id="9" w:name="_nax90coynxy8" w:colFirst="0" w:colLast="0"/>
+      <w:bookmarkEnd w:id="9"/>
+      <w:r>
+        <w:lastRenderedPageBreak/>
+        <w:t>Review of Related Literature</w:t>
+      </w:r>
+    </w:p>
+    <w:p>
+      <w:r>
+        <w:t xml:space="preserve">We’ve gathered these studies to back up our goals for the </w:t>
+      </w:r>
+      <w:proofErr w:type="spellStart"/>
+      <w:r>
+        <w:t>Mangatarem</w:t>
+      </w:r>
+      <w:proofErr w:type="spellEnd"/>
+      <w:r>
+        <w:t xml:space="preserve"> project. We focused on research from 2020 to 2025 that shows why digital maps and better data management are so vital. We’ve organized these into local and foreign studies to show how they help us hit our four main objectives.</w:t>
+      </w:r>
+    </w:p>
+    <w:p>
+      <w:pPr>
+        <w:pStyle w:val="Heading3"/>
+      </w:pPr>
+      <w:bookmarkStart w:id="10" w:name="_gpyssydhe6e4" w:colFirst="0" w:colLast="0"/>
       <w:bookmarkEnd w:id="10"/>
-      <w:r>
-        <w:t>Review of Related Literature</w:t>
-      </w:r>
-    </w:p>
-    <w:p>
-      <w:r>
-        <w:t xml:space="preserve">We’ve gathered these studies to back up our goals for the </w:t>
-      </w:r>
-      <w:proofErr w:type="spellStart"/>
-      <w:r>
-        <w:t>Mangatarem</w:t>
-      </w:r>
-      <w:proofErr w:type="spellEnd"/>
-      <w:r>
-        <w:t xml:space="preserve"> project. We focused on research from 2020 to 2025 that shows why digital maps and better data management are so vital. We’ve organized these into local and foreign studies to show how they help us </w:t>
-      </w:r>
-      <w:proofErr w:type="gramStart"/>
-      <w:r>
-        <w:t>hit</w:t>
-      </w:r>
-      <w:proofErr w:type="gramEnd"/>
-      <w:r>
-        <w:t xml:space="preserve"> our four main objectives.</w:t>
-      </w:r>
-    </w:p>
-    <w:p>
-      <w:pPr>
-        <w:pStyle w:val="Heading3"/>
-      </w:pPr>
-      <w:bookmarkStart w:id="11" w:name="_gpyssydhe6e4" w:colFirst="0" w:colLast="0"/>
-      <w:bookmarkEnd w:id="11"/>
       <w:r>
         <w:t>Local Studies</w:t>
       </w:r>
@@ -1207,15 +1476,7 @@
     </w:p>
     <w:p>
       <w:r>
-        <w:t xml:space="preserve">Coro II and his team (2022) studied how Siargao moved to a digital setup. They found that the system </w:t>
-      </w:r>
-      <w:proofErr w:type="gramStart"/>
-      <w:r>
-        <w:t>actually worked</w:t>
-      </w:r>
-      <w:proofErr w:type="gramEnd"/>
-      <w:r>
-        <w:t xml:space="preserve"> because they got local leaders involved from the start. This supports our work because it shows that a digital platform helps rural towns stay accurate and organized. It gives us a real-world example for our fourth objective on how to roll out the system.</w:t>
+        <w:t>Coro II and his team (2022) studied how Siargao moved to a digital setup. They found that the system actually worked because they got local leaders involved from the start. This supports our work because it shows that a digital platform helps rural towns stay accurate and organized. It gives us a real-world example for our fourth objective on how to roll out the system.</w:t>
       </w:r>
     </w:p>
     <w:p>
@@ -1232,15 +1493,7 @@
     </w:p>
     <w:p>
       <w:r>
-        <w:t xml:space="preserve">Zuniga (2023) tested how provincial maps work when you mix history with GPS data. He found that letting local people </w:t>
-      </w:r>
-      <w:proofErr w:type="gramStart"/>
-      <w:r>
-        <w:t>upload info—</w:t>
-      </w:r>
-      <w:proofErr w:type="gramEnd"/>
-      <w:r>
-        <w:t>while experts checked it—made the data much better. This confirms our plan for the second objective, where we let barangay leaders be the ones to share their own local stories.</w:t>
+        <w:t>Zuniga (2023) tested how provincial maps work when you mix history with GPS data. He found that letting local people upload info—while experts checked it—made the data much better. This confirms our plan for the second objective, where we let barangay leaders be the ones to share their own local stories.</w:t>
       </w:r>
     </w:p>
     <w:p>
@@ -1302,8 +1555,8 @@
       <w:pPr>
         <w:pStyle w:val="Heading3"/>
       </w:pPr>
-      <w:bookmarkStart w:id="12" w:name="_g9ti8pg2s2t1" w:colFirst="0" w:colLast="0"/>
-      <w:bookmarkEnd w:id="12"/>
+      <w:bookmarkStart w:id="11" w:name="_g9ti8pg2s2t1" w:colFirst="0" w:colLast="0"/>
+      <w:bookmarkEnd w:id="11"/>
       <w:r>
         <w:t>Foreign Studies</w:t>
       </w:r>
@@ -1333,13 +1586,9 @@
       <w:r>
         <w:t xml:space="preserve">Kumar and Singh (2022) built a web map that used old photos to show how a place changed over time. They found that seeing "then and now" photos makes users feel more connected to </w:t>
       </w:r>
-      <w:proofErr w:type="gramStart"/>
-      <w:r>
-        <w:t>the history</w:t>
-      </w:r>
-      <w:proofErr w:type="gramEnd"/>
-      <w:r>
-        <w:t xml:space="preserve">. This fits our first and second objectives because it gives us a technical model for how our map can show </w:t>
+      <w:r>
+        <w:lastRenderedPageBreak/>
+        <w:t xml:space="preserve">the history. This fits our first and second objectives because it gives us a technical model for how our map can show </w:t>
       </w:r>
       <w:proofErr w:type="spellStart"/>
       <w:r>
@@ -1402,15 +1651,7 @@
     </w:p>
     <w:p>
       <w:r>
-        <w:t xml:space="preserve">Wang (2023) explained that you can't just map buildings; you also </w:t>
-      </w:r>
-      <w:proofErr w:type="gramStart"/>
-      <w:r>
-        <w:t>have to</w:t>
-      </w:r>
-      <w:proofErr w:type="gramEnd"/>
-      <w:r>
-        <w:t xml:space="preserve"> map traditions and festivals. He showed that a town runs much better when its data includes both physical spots and local habits. This supports our second and third objectives by giving us a framework for what kind of categories we should use on our site.</w:t>
+        <w:t>Wang (2023) explained that you can't just map buildings; you also have to map traditions and festivals. He showed that a town runs much better when its data includes both physical spots and local habits. This supports our second and third objectives by giving us a framework for what kind of categories we should use on our site.</w:t>
       </w:r>
     </w:p>
     <w:p>
@@ -1427,16 +1668,7 @@
     </w:p>
     <w:p>
       <w:r>
-        <w:lastRenderedPageBreak/>
-        <w:t xml:space="preserve">Tan (2023) built a travel site that suggested places based on what users liked. He found that if a site is easy to use from the start, people won't fight the change. He also suggested making the software </w:t>
-      </w:r>
-      <w:proofErr w:type="gramStart"/>
-      <w:r>
-        <w:t>in</w:t>
-      </w:r>
-      <w:proofErr w:type="gramEnd"/>
-      <w:r>
-        <w:t xml:space="preserve"> parts so it's easy to update later. This helps us with our second and fourth objectives as we plan out our filters and how we'll deploy the system.</w:t>
+        <w:t>Tan (2023) built a travel site that suggested places based on what users liked. He found that if a site is easy to use from the start, people won't fight the change. He also suggested making the software in parts so it's easy to update later. This helps us with our second and fourth objectives as we plan out our filters and how we'll deploy the system.</w:t>
       </w:r>
     </w:p>
     <w:p>
@@ -1455,23 +1687,46 @@
       <w:r>
         <w:t>Petrovic (2022) looked at how to keep heritage sites safe in tropical areas using software. He found that systems that let people monitor conditions regularly were much more accurate. This backs up our third and fourth objectives because it shows why we need to test our security and have a plan for regular data updates.</w:t>
       </w:r>
-      <w:bookmarkStart w:id="13" w:name="_1hu1mvn5d16k" w:colFirst="0" w:colLast="0"/>
+      <w:bookmarkStart w:id="12" w:name="_1hu1mvn5d16k" w:colFirst="0" w:colLast="0"/>
+      <w:bookmarkEnd w:id="12"/>
+    </w:p>
+    <w:p/>
+    <w:p>
+      <w:pPr>
+        <w:pStyle w:val="Heading1"/>
+      </w:pPr>
+      <w:bookmarkStart w:id="13" w:name="_h5lmuwe09ec4" w:colFirst="0" w:colLast="0"/>
       <w:bookmarkEnd w:id="13"/>
-    </w:p>
-    <w:p/>
-    <w:p>
-      <w:pPr>
-        <w:pStyle w:val="Heading1"/>
-      </w:pPr>
-      <w:bookmarkStart w:id="14" w:name="_h5lmuwe09ec4" w:colFirst="0" w:colLast="0"/>
+      <w:r>
+        <w:t>Chapter 2: Methodology and Design</w:t>
+      </w:r>
+    </w:p>
+    <w:p>
+      <w:r>
+        <w:t xml:space="preserve">This chapter details the development methods and design strategies we used to create the Interactive Digital Cultural Map and Local Tourism Information System for </w:t>
+      </w:r>
+      <w:proofErr w:type="spellStart"/>
+      <w:r>
+        <w:t>Mangatarem</w:t>
+      </w:r>
+      <w:proofErr w:type="spellEnd"/>
+      <w:r>
+        <w:t>, Pangasinan. We want to provide a clear record of our technical decisions and the specific steps we took to deliver a functional tool for the LGU.</w:t>
+      </w:r>
+    </w:p>
+    <w:p>
+      <w:pPr>
+        <w:pStyle w:val="Heading2"/>
+      </w:pPr>
+      <w:bookmarkStart w:id="14" w:name="_v8iiefqphnwv" w:colFirst="0" w:colLast="0"/>
       <w:bookmarkEnd w:id="14"/>
       <w:r>
-        <w:t>Chapter 2: Methodology and Design</w:t>
-      </w:r>
-    </w:p>
-    <w:p>
-      <w:r>
-        <w:t xml:space="preserve">This chapter details the development methods and design strategies we used to create the Interactive Digital Cultural Map and Local Tourism Information System for </w:t>
+        <w:t>Software Development Methodology</w:t>
+      </w:r>
+    </w:p>
+    <w:p>
+      <w:r>
+        <w:t xml:space="preserve">In software engineering, a Software Development Methodology (SDM) is like a clear roadmap for a project. Without it, a team can easily lose focus, miss deadlines, or build features that nobody actually needs. For our project in </w:t>
       </w:r>
       <w:proofErr w:type="spellStart"/>
       <w:r>
@@ -1479,46 +1734,7 @@
       </w:r>
       <w:proofErr w:type="spellEnd"/>
       <w:r>
-        <w:t>, Pangasinan. We want to provide a clear record of our technical decisions and the specific steps we took to deliver a functional tool for the LGU.</w:t>
-      </w:r>
-    </w:p>
-    <w:p>
-      <w:pPr>
-        <w:pStyle w:val="Heading2"/>
-      </w:pPr>
-      <w:bookmarkStart w:id="15" w:name="_v8iiefqphnwv" w:colFirst="0" w:colLast="0"/>
-      <w:bookmarkEnd w:id="15"/>
-      <w:r>
-        <w:t>Software Development Methodology</w:t>
-      </w:r>
-    </w:p>
-    <w:p>
-      <w:r>
-        <w:t xml:space="preserve">In software engineering, a Software Development Methodology (SDM) is like a clear roadmap for a project. Without it, a team can easily lose focus, miss deadlines, or build features that nobody </w:t>
-      </w:r>
-      <w:proofErr w:type="gramStart"/>
-      <w:r>
-        <w:t>actually needs</w:t>
-      </w:r>
-      <w:proofErr w:type="gramEnd"/>
-      <w:r>
-        <w:t xml:space="preserve">. For our project in </w:t>
-      </w:r>
-      <w:proofErr w:type="spellStart"/>
-      <w:r>
-        <w:t>Mangatarem</w:t>
-      </w:r>
-      <w:proofErr w:type="spellEnd"/>
-      <w:r>
-        <w:t xml:space="preserve">, having this structure helps us stay organized while we plan, code, and test the digital map. It makes sure we're </w:t>
-      </w:r>
-      <w:proofErr w:type="gramStart"/>
-      <w:r>
-        <w:t>actually building</w:t>
-      </w:r>
-      <w:proofErr w:type="gramEnd"/>
-      <w:r>
-        <w:t xml:space="preserve"> a tool that fits the LGU’s workflow and that the final product is impactful for the whole community.</w:t>
+        <w:t>, having this structure helps us stay organized while we plan, code, and test the digital map. It makes sure we're actually building a tool that fits the LGU’s workflow and that the final product is impactful for the whole community.</w:t>
       </w:r>
     </w:p>
     <w:p>
@@ -1555,7 +1771,11 @@
         <w:t>Participatory GIS (PGIS)</w:t>
       </w:r>
       <w:r>
-        <w:t xml:space="preserve"> framework. We picked this because it focuses on building prototypes and getting feedback quickly rather than spending months just planning on paper. Since tourism data and the needs of our barangay leaders can change as they see the site evolve, RAD lets us adapt fast. By using PGIS, we also make sure the community has a say in how we represent their local culture on the map, which makes the data much more accurate.</w:t>
+        <w:t xml:space="preserve"> framework. We picked this because it focuses on building prototypes and getting </w:t>
+      </w:r>
+      <w:r>
+        <w:lastRenderedPageBreak/>
+        <w:t>feedback quickly rather than spending months just planning on paper. Since tourism data and the needs of our barangay leaders can change as they see the site evolve, RAD lets us adapt fast. By using PGIS, we also make sure the community has a say in how we represent their local culture on the map, which makes the data much more accurate.</w:t>
       </w:r>
     </w:p>
     <w:p>
@@ -1572,23 +1792,7 @@
     </w:p>
     <w:p>
       <w:r>
-        <w:t xml:space="preserve">RAD is an agile way of working that prioritizes quick delivery and user feedback. Instead of trying to get every detail perfect at the start, we build small, working versions of the system and refine them </w:t>
-      </w:r>
-      <w:proofErr w:type="gramStart"/>
-      <w:r>
-        <w:t>over and over</w:t>
-      </w:r>
-      <w:proofErr w:type="gramEnd"/>
-      <w:r>
-        <w:t xml:space="preserve">. It's known for keeping the people who will </w:t>
-      </w:r>
-      <w:proofErr w:type="gramStart"/>
-      <w:r>
-        <w:t>actually use</w:t>
-      </w:r>
-      <w:proofErr w:type="gramEnd"/>
-      <w:r>
-        <w:t xml:space="preserve"> the system involved every step of the way. This method is perfect for projects where the look and feel of the site are vital and where we expect to make changes as users interact with our early designs.</w:t>
+        <w:t>RAD is an agile way of working that prioritizes quick delivery and user feedback. Instead of trying to get every detail perfect at the start, we build small, working versions of the system and refine them over and over. It's known for keeping the people who will actually use the system involved every step of the way. This method is perfect for projects where the look and feel of the site are vital and where we expect to make changes as users interact with our early designs.</w:t>
       </w:r>
     </w:p>
     <w:p>
@@ -1635,11 +1839,7 @@
         <w:t>Requirements Planning:</w:t>
       </w:r>
       <w:r>
-        <w:t xml:space="preserve"> We started by meeting with the LGU Tourism Office staff to find the gaps in their current manual filing system. We identified the main goals and </w:t>
-      </w:r>
-      <w:r>
-        <w:lastRenderedPageBreak/>
-        <w:t xml:space="preserve">defined the two primary user categories: </w:t>
+        <w:t xml:space="preserve"> We started by meeting with the LGU Tourism Office staff to find the gaps in their current manual filing system. We identified the main goals and defined the two primary user categories: </w:t>
       </w:r>
       <w:r>
         <w:rPr>
@@ -1755,23 +1955,15 @@
         <w:t>Cutover (Testing and Deployment):</w:t>
       </w:r>
       <w:r>
-        <w:t xml:space="preserve"> In this final stage, we perform functional, security, and usability tests to make sure the site is safe and fast. Once we resolve any issues, we’ll launch the system for the LGU. We’ll also hold training sessions for the Administrative and Stakeholder category (LGU staff and barangay leaders) and give them user </w:t>
-      </w:r>
-      <w:proofErr w:type="gramStart"/>
-      <w:r>
-        <w:t>manuals</w:t>
-      </w:r>
-      <w:proofErr w:type="gramEnd"/>
-      <w:r>
-        <w:t xml:space="preserve"> so they feel comfortable running the site on their own.</w:t>
+        <w:t xml:space="preserve"> In this final stage, we perform functional, security, and usability tests to make sure the site is safe and fast. Once we resolve any issues, we’ll launch the system for the LGU. We’ll also hold training sessions for the Administrative and Stakeholder category (LGU staff and barangay leaders) and give them user manuals so they feel comfortable running the site on their own.</w:t>
       </w:r>
     </w:p>
     <w:p>
       <w:pPr>
         <w:pStyle w:val="Heading2"/>
       </w:pPr>
-      <w:bookmarkStart w:id="16" w:name="_ih01wf9cphvq" w:colFirst="0" w:colLast="0"/>
-      <w:bookmarkEnd w:id="16"/>
+      <w:bookmarkStart w:id="15" w:name="_ih01wf9cphvq" w:colFirst="0" w:colLast="0"/>
+      <w:bookmarkEnd w:id="15"/>
       <w:r>
         <w:t>Sources of Data</w:t>
       </w:r>
@@ -1786,15 +1978,7 @@
       </w:r>
       <w:proofErr w:type="spellEnd"/>
       <w:r>
-        <w:t xml:space="preserve">, </w:t>
-      </w:r>
-      <w:proofErr w:type="gramStart"/>
-      <w:r>
-        <w:t>Pangasinan</w:t>
-      </w:r>
-      <w:proofErr w:type="gramEnd"/>
-      <w:r>
-        <w:t xml:space="preserve"> that hold crucial tourism, cultural, and historical information relevant to the system. Key data sources include:</w:t>
+        <w:t>, Pangasinan that hold crucial tourism, cultural, and historical information relevant to the system. Key data sources include:</w:t>
       </w:r>
     </w:p>
     <w:p>
@@ -1821,6 +2005,7 @@
           <w:b/>
           <w:bCs/>
         </w:rPr>
+        <w:lastRenderedPageBreak/>
         <w:t>LGU Tourism Office Staff</w:t>
       </w:r>
       <w:r>
@@ -1902,24 +2087,15 @@
       <w:pPr>
         <w:pStyle w:val="Heading2"/>
       </w:pPr>
-      <w:bookmarkStart w:id="17" w:name="_43htouo8q2t2" w:colFirst="0" w:colLast="0"/>
-      <w:bookmarkEnd w:id="17"/>
-      <w:r>
-        <w:lastRenderedPageBreak/>
+      <w:bookmarkStart w:id="16" w:name="_43htouo8q2t2" w:colFirst="0" w:colLast="0"/>
+      <w:bookmarkEnd w:id="16"/>
+      <w:r>
         <w:t>Data Gathering Techniques</w:t>
       </w:r>
     </w:p>
     <w:p>
       <w:r>
-        <w:t xml:space="preserve">To make sure we built a system that </w:t>
-      </w:r>
-      <w:proofErr w:type="gramStart"/>
-      <w:r>
-        <w:t>actually solves</w:t>
-      </w:r>
-      <w:proofErr w:type="gramEnd"/>
-      <w:r>
-        <w:t xml:space="preserve"> the town's problems, we used several different ways to collect information. We didn't want to just guess what the LGU needed, so we went straight to the people who handle </w:t>
+        <w:t xml:space="preserve">To make sure we built a system that actually solves the town's problems, we used several different ways to collect information. We didn't want to just guess what the LGU needed, so we went straight to the people who handle </w:t>
       </w:r>
       <w:proofErr w:type="spellStart"/>
       <w:r>
@@ -2006,15 +2182,7 @@
         <w:ind w:left="720"/>
       </w:pPr>
       <w:r>
-        <w:t xml:space="preserve">Why: We used this technique to hear about the "pain points" that only a worker would know. It helped us understand their manual workflow so we could design a digital version that </w:t>
-      </w:r>
-      <w:proofErr w:type="gramStart"/>
-      <w:r>
-        <w:t>actually makes</w:t>
-      </w:r>
-      <w:proofErr w:type="gramEnd"/>
-      <w:r>
-        <w:t xml:space="preserve"> their lives easier.</w:t>
+        <w:t>Why: We used this technique to hear about the "pain points" that only a worker would know. It helped us understand their manual workflow so we could design a digital version that actually makes their lives easier.</w:t>
       </w:r>
     </w:p>
     <w:p>
@@ -2072,15 +2240,7 @@
         <w:ind w:left="720"/>
       </w:pPr>
       <w:r>
-        <w:t xml:space="preserve">When: We did this at the same time as our interviews. This allowed us to see if the work they described matched what they </w:t>
-      </w:r>
-      <w:proofErr w:type="gramStart"/>
-      <w:r>
-        <w:t>actually did</w:t>
-      </w:r>
-      <w:proofErr w:type="gramEnd"/>
-      <w:r>
-        <w:t xml:space="preserve"> on a busy day.</w:t>
+        <w:t>When: We did this at the same time as our interviews. This allowed us to see if the work they described matched what they actually did on a busy day.</w:t>
       </w:r>
     </w:p>
     <w:p>
@@ -2108,37 +2268,25 @@
       <w:pPr>
         <w:pStyle w:val="Heading2"/>
       </w:pPr>
-      <w:bookmarkStart w:id="18" w:name="_2ovalge5j2dm" w:colFirst="0" w:colLast="0"/>
+      <w:bookmarkStart w:id="17" w:name="_2ovalge5j2dm" w:colFirst="0" w:colLast="0"/>
+      <w:bookmarkEnd w:id="17"/>
+      <w:r>
+        <w:t>System Design</w:t>
+      </w:r>
+    </w:p>
+    <w:p>
+      <w:pPr>
+        <w:pStyle w:val="Heading3"/>
+      </w:pPr>
+      <w:bookmarkStart w:id="18" w:name="_5f5f2cxkmb8o" w:colFirst="0" w:colLast="0"/>
       <w:bookmarkEnd w:id="18"/>
       <w:r>
-        <w:t>System Design</w:t>
-      </w:r>
-    </w:p>
-    <w:p>
-      <w:pPr>
-        <w:pStyle w:val="Heading3"/>
-      </w:pPr>
-      <w:bookmarkStart w:id="19" w:name="_5f5f2cxkmb8o" w:colFirst="0" w:colLast="0"/>
-      <w:bookmarkEnd w:id="19"/>
-      <w:r>
         <w:t>System Architecture</w:t>
       </w:r>
     </w:p>
     <w:p>
       <w:r>
-        <w:t xml:space="preserve">The System Architecture diagram provides a high-level structural overview of the Interactive Digital Cultural Map and Local Tourism Information System. It defines how the different technological components — from the user's device to the backend database — interact to deliver the system's services. </w:t>
-      </w:r>
-      <w:proofErr w:type="gramStart"/>
-      <w:r>
-        <w:t>A clear</w:t>
-      </w:r>
-      <w:proofErr w:type="gramEnd"/>
-      <w:r>
-        <w:t xml:space="preserve"> architecture is important because it establishes the </w:t>
-      </w:r>
-      <w:r>
-        <w:lastRenderedPageBreak/>
-        <w:t>blueprint for the system's technical structure, ensuring that all components are properly integrated, scalable, and secure.</w:t>
+        <w:t>The System Architecture diagram provides a high-level structural overview of the Interactive Digital Cultural Map and Local Tourism Information System. It defines how the different technological components — from the user's device to the backend database — interact to deliver the system's services. A clear architecture is important because it establishes the blueprint for the system's technical structure, ensuring that all components are properly integrated, scalable, and secure.</w:t>
       </w:r>
     </w:p>
     <w:p>
@@ -2154,172 +2302,6 @@
       </w:pPr>
     </w:p>
     <w:p>
-      <w:r>
-        <w:t xml:space="preserve">The architecture follows a modern three-tier cloud-native model. At the </w:t>
-      </w:r>
-      <w:r>
-        <w:rPr>
-          <w:b/>
-          <w:bCs/>
-        </w:rPr>
-        <w:t>Client Layer</w:t>
-      </w:r>
-      <w:r>
-        <w:t xml:space="preserve">, users — categorized as either </w:t>
-      </w:r>
-      <w:r>
-        <w:rPr>
-          <w:b/>
-          <w:bCs/>
-        </w:rPr>
-        <w:t>Administrative and Stakeholder Users</w:t>
-      </w:r>
-      <w:r>
-        <w:t xml:space="preserve"> or </w:t>
-      </w:r>
-      <w:r>
-        <w:rPr>
-          <w:b/>
-          <w:bCs/>
-        </w:rPr>
-        <w:t>General Public and Academic Users</w:t>
-      </w:r>
-      <w:r>
-        <w:t xml:space="preserve"> — interact with the system through standard web browsers. The user interface is built with HTML, CSS (utilizing the Tailwind CSS framework), and JavaScript, with </w:t>
-      </w:r>
-      <w:proofErr w:type="spellStart"/>
-      <w:r>
-        <w:rPr>
-          <w:b/>
-          <w:bCs/>
-        </w:rPr>
-        <w:t>Mapbox</w:t>
-      </w:r>
-      <w:proofErr w:type="spellEnd"/>
-      <w:r>
-        <w:rPr>
-          <w:b/>
-          <w:bCs/>
-        </w:rPr>
-        <w:t xml:space="preserve"> GL JS</w:t>
-      </w:r>
-      <w:r>
-        <w:t xml:space="preserve"> integrated for high-performance spatial visualization. When a user performs an action, the client sends HTTPS requests to the </w:t>
-      </w:r>
-      <w:r>
-        <w:rPr>
-          <w:b/>
-          <w:bCs/>
-        </w:rPr>
-        <w:t>Cloud Platform Layer</w:t>
-      </w:r>
-      <w:r>
-        <w:t xml:space="preserve">, hosted on </w:t>
-      </w:r>
-      <w:proofErr w:type="spellStart"/>
-      <w:r>
-        <w:rPr>
-          <w:b/>
-          <w:bCs/>
-        </w:rPr>
-        <w:t>Vercel</w:t>
-      </w:r>
-      <w:proofErr w:type="spellEnd"/>
-      <w:r>
-        <w:t xml:space="preserve">. The backend application logic is implemented in </w:t>
-      </w:r>
-      <w:r>
-        <w:rPr>
-          <w:b/>
-          <w:bCs/>
-        </w:rPr>
-        <w:t>Python</w:t>
-      </w:r>
-      <w:r>
-        <w:t xml:space="preserve"> using the </w:t>
-      </w:r>
-      <w:r>
-        <w:rPr>
-          <w:b/>
-          <w:bCs/>
-        </w:rPr>
-        <w:t>Flask</w:t>
-      </w:r>
-      <w:r>
-        <w:t xml:space="preserve"> framework, running as optimized serverless functions. This layer processes requests such as user authentication, cultural heritage form validation, and content moderation workflows. The </w:t>
-      </w:r>
-      <w:r>
-        <w:rPr>
-          <w:b/>
-          <w:bCs/>
-        </w:rPr>
-        <w:t>Data Persistence Layer</w:t>
-      </w:r>
-      <w:r>
-        <w:t xml:space="preserve"> leverages </w:t>
-      </w:r>
-      <w:proofErr w:type="spellStart"/>
-      <w:r>
-        <w:rPr>
-          <w:b/>
-          <w:bCs/>
-        </w:rPr>
-        <w:t>Supabase</w:t>
-      </w:r>
-      <w:proofErr w:type="spellEnd"/>
-      <w:r>
-        <w:t xml:space="preserve"> for its primary PostgreSQL database and object storage, and </w:t>
-      </w:r>
-      <w:proofErr w:type="spellStart"/>
-      <w:r>
-        <w:rPr>
-          <w:b/>
-          <w:bCs/>
-        </w:rPr>
-        <w:t>Upstash</w:t>
-      </w:r>
-      <w:proofErr w:type="spellEnd"/>
-      <w:r>
-        <w:t xml:space="preserve"> for Redis-based </w:t>
-      </w:r>
-      <w:proofErr w:type="gramStart"/>
-      <w:r>
-        <w:t>caching</w:t>
-      </w:r>
-      <w:proofErr w:type="gramEnd"/>
-      <w:r>
-        <w:t>. This layer stores all persistent data, including user accounts, detailed heritage profiles, business establishment records, and system-wide audit logs. This cloud-native architecture ensures a highly available, secure, and performant separation between the interactive interface and the central data repositories.</w:t>
-      </w:r>
-    </w:p>
-    <w:p>
-      <w:pPr>
-        <w:pStyle w:val="Heading3"/>
-      </w:pPr>
-      <w:bookmarkStart w:id="20" w:name="_6q1d9hlo6qix" w:colFirst="0" w:colLast="0"/>
-      <w:bookmarkEnd w:id="20"/>
-      <w:r>
-        <w:t>Existing Process Flowchart</w:t>
-      </w:r>
-    </w:p>
-    <w:p>
-      <w:r>
-        <w:t xml:space="preserve">A flowchart is a graphical representation of a process that uses standardized symbols — such as rectangles for actions, diamonds for decisions, and arrows for flow </w:t>
-      </w:r>
-      <w:proofErr w:type="gramStart"/>
-      <w:r>
-        <w:t>direction —</w:t>
-      </w:r>
-      <w:proofErr w:type="gramEnd"/>
-      <w:r>
-        <w:t xml:space="preserve"> to illustrate the sequence of steps, decision points, and outcomes. Flowcharts are important in system analysis because they provide a clear, visual understanding of the current (as-is) process, making it easier to identify </w:t>
-      </w:r>
-      <w:proofErr w:type="gramStart"/>
-      <w:r>
-        <w:t>bottle</w:t>
-      </w:r>
-      <w:proofErr w:type="gramEnd"/>
-    </w:p>
-    <w:p>
       <w:pPr>
         <w:widowControl w:val="0"/>
         <w:pBdr>
@@ -2330,34 +2312,51 @@
           <w:between w:val="nil"/>
         </w:pBdr>
       </w:pPr>
-    </w:p>
-    <w:p>
-      <w:r>
-        <w:t xml:space="preserve">The flowchart illustrates the two primary manual processes currently used in </w:t>
-      </w:r>
-      <w:proofErr w:type="spellStart"/>
-      <w:r>
-        <w:t>Mangatarem</w:t>
-      </w:r>
-      <w:proofErr w:type="spellEnd"/>
-      <w:r>
-        <w:t xml:space="preserve">, revealing significant gaps in information accessibility and data synchronization. The first process (Top Path) begins when a tourist seeks information. Currently, the tourist is forced to choose between searching unverified social media pages—which often harbor outdated or conflicting details leading to visitor confusion—or </w:t>
-      </w:r>
-      <w:proofErr w:type="gramStart"/>
-      <w:r>
-        <w:t>traveling</w:t>
-      </w:r>
-      <w:proofErr w:type="gramEnd"/>
-      <w:r>
-        <w:t xml:space="preserve"> physically to the Municipal Tourism Office. At the office, staff must manually browse through paper-bound records and physical files to answer inquiries. If the relevant file is missing or being used by another officer, the information remains unavailable, resulting in </w:t>
-      </w:r>
-      <w:proofErr w:type="gramStart"/>
-      <w:r>
-        <w:t>a poor</w:t>
-      </w:r>
-      <w:proofErr w:type="gramEnd"/>
-      <w:r>
-        <w:t xml:space="preserve"> visitor experience.</w:t>
+      <w:r>
+        <w:rPr>
+          <w:noProof/>
+        </w:rPr>
+        <w:drawing>
+          <wp:inline distT="0" distB="0" distL="0" distR="0" wp14:anchorId="5D6A0625" wp14:editId="655BC7D2">
+            <wp:extent cx="5943600" cy="3587115"/>
+            <wp:effectExtent l="0" t="0" r="0" b="0"/>
+            <wp:docPr id="1059027152" name="Picture 3"/>
+            <wp:cNvGraphicFramePr>
+              <a:graphicFrameLocks xmlns:a="http://schemas.openxmlformats.org/drawingml/2006/main" noChangeAspect="1"/>
+            </wp:cNvGraphicFramePr>
+            <a:graphic xmlns:a="http://schemas.openxmlformats.org/drawingml/2006/main">
+              <a:graphicData uri="http://schemas.openxmlformats.org/drawingml/2006/picture">
+                <pic:pic xmlns:pic="http://schemas.openxmlformats.org/drawingml/2006/picture">
+                  <pic:nvPicPr>
+                    <pic:cNvPr id="1059027152" name=""/>
+                    <pic:cNvPicPr/>
+                  </pic:nvPicPr>
+                  <pic:blipFill>
+                    <a:blip r:embed="rId10" cstate="print">
+                      <a:extLst>
+                        <a:ext uri="{28A0092B-C50C-407E-A947-70E740481C1C}">
+                          <a14:useLocalDpi xmlns:a14="http://schemas.microsoft.com/office/drawing/2010/main" val="0"/>
+                        </a:ext>
+                      </a:extLst>
+                    </a:blip>
+                    <a:stretch>
+                      <a:fillRect/>
+                    </a:stretch>
+                  </pic:blipFill>
+                  <pic:spPr>
+                    <a:xfrm>
+                      <a:off x="0" y="0"/>
+                      <a:ext cx="5943600" cy="3587115"/>
+                    </a:xfrm>
+                    <a:prstGeom prst="rect">
+                      <a:avLst/>
+                    </a:prstGeom>
+                  </pic:spPr>
+                </pic:pic>
+              </a:graphicData>
+            </a:graphic>
+          </wp:inline>
+        </w:drawing>
       </w:r>
     </w:p>
     <w:p>
@@ -2374,25 +2373,214 @@
     </w:p>
     <w:p>
       <w:r>
-        <w:t>The second process (Bottom Path) describes the current information reporting workflow from the grassroots level. When a Barangay Representative has a new cultural event or attraction update, they must either prepare a physical report for delivery or send informal messages via text or social media. This non-standardized communication forces LGU Tourism staff to manually consolidate disparate data formats. Any missing information necessitates a repetitive cycle of phone calls and follow-ups, causing significant time lags. By the time the LGU updates its printed brochures or social media posts, the information is often already weeks old. This flowchart demonstrates that the current reliance on manual, physical-first documentation is the root cause of the municipality's fragmented and delay-prone tourism information ecosystem.</w:t>
+        <w:t xml:space="preserve">The architecture follows a modern three-tier cloud-native model. At the </w:t>
+      </w:r>
+      <w:r>
+        <w:rPr>
+          <w:b/>
+          <w:bCs/>
+        </w:rPr>
+        <w:t>Client Layer</w:t>
+      </w:r>
+      <w:r>
+        <w:t xml:space="preserve">, users — categorized as either </w:t>
+      </w:r>
+      <w:r>
+        <w:rPr>
+          <w:b/>
+          <w:bCs/>
+        </w:rPr>
+        <w:t>Administrative and Stakeholder Users</w:t>
+      </w:r>
+      <w:r>
+        <w:t xml:space="preserve"> or </w:t>
+      </w:r>
+      <w:r>
+        <w:rPr>
+          <w:b/>
+          <w:bCs/>
+        </w:rPr>
+        <w:t>General Public and Academic Users</w:t>
+      </w:r>
+      <w:r>
+        <w:t xml:space="preserve"> — interact with the system through standard web browsers. The user interface is built with HTML, CSS (utilizing the Tailwind CSS framework), and JavaScript, with </w:t>
+      </w:r>
+      <w:proofErr w:type="spellStart"/>
+      <w:r>
+        <w:rPr>
+          <w:b/>
+          <w:bCs/>
+        </w:rPr>
+        <w:lastRenderedPageBreak/>
+        <w:t>Mapbox</w:t>
+      </w:r>
+      <w:proofErr w:type="spellEnd"/>
+      <w:r>
+        <w:rPr>
+          <w:b/>
+          <w:bCs/>
+        </w:rPr>
+        <w:t xml:space="preserve"> GL JS</w:t>
+      </w:r>
+      <w:r>
+        <w:t xml:space="preserve"> integrated for high-performance spatial visualization. When a user performs an action, the client sends HTTPS requests to the </w:t>
+      </w:r>
+      <w:r>
+        <w:rPr>
+          <w:b/>
+          <w:bCs/>
+        </w:rPr>
+        <w:t>Cloud Platform Layer</w:t>
+      </w:r>
+      <w:r>
+        <w:t xml:space="preserve">, hosted on </w:t>
+      </w:r>
+      <w:proofErr w:type="spellStart"/>
+      <w:r>
+        <w:rPr>
+          <w:b/>
+          <w:bCs/>
+        </w:rPr>
+        <w:t>Vercel</w:t>
+      </w:r>
+      <w:proofErr w:type="spellEnd"/>
+      <w:r>
+        <w:t xml:space="preserve">. The backend application logic is implemented in </w:t>
+      </w:r>
+      <w:r>
+        <w:rPr>
+          <w:b/>
+          <w:bCs/>
+        </w:rPr>
+        <w:t>Python</w:t>
+      </w:r>
+      <w:r>
+        <w:t xml:space="preserve"> using the </w:t>
+      </w:r>
+      <w:r>
+        <w:rPr>
+          <w:b/>
+          <w:bCs/>
+        </w:rPr>
+        <w:t>Flask</w:t>
+      </w:r>
+      <w:r>
+        <w:t xml:space="preserve"> framework, running as optimized serverless functions. This layer processes requests such as user authentication,</w:t>
+      </w:r>
+    </w:p>
+    <w:p/>
+    <w:p>
+      <w:r>
+        <w:t xml:space="preserve">cultural heritage form validation, and content moderation workflows. The </w:t>
+      </w:r>
+      <w:r>
+        <w:rPr>
+          <w:b/>
+          <w:bCs/>
+        </w:rPr>
+        <w:t>Data Persistence Layer</w:t>
+      </w:r>
+      <w:r>
+        <w:t xml:space="preserve"> leverages </w:t>
+      </w:r>
+      <w:proofErr w:type="spellStart"/>
+      <w:r>
+        <w:rPr>
+          <w:b/>
+          <w:bCs/>
+        </w:rPr>
+        <w:t>Supabase</w:t>
+      </w:r>
+      <w:proofErr w:type="spellEnd"/>
+      <w:r>
+        <w:t xml:space="preserve"> for its primary PostgreSQL database and object storage, and </w:t>
+      </w:r>
+      <w:proofErr w:type="spellStart"/>
+      <w:r>
+        <w:rPr>
+          <w:b/>
+          <w:bCs/>
+        </w:rPr>
+        <w:t>Upstash</w:t>
+      </w:r>
+      <w:proofErr w:type="spellEnd"/>
+      <w:r>
+        <w:t xml:space="preserve"> for Redis-based caching. This layer stores all persistent data, including user accounts, detailed heritage profiles, business establishment records, and system-wide audit logs. This cloud-native architecture ensures a highly available, secure, and performant separation between the interactive interface and the central data repositories.</w:t>
       </w:r>
     </w:p>
     <w:p>
       <w:pPr>
         <w:pStyle w:val="Heading3"/>
       </w:pPr>
-      <w:bookmarkStart w:id="21" w:name="_s2higp4eiy85" w:colFirst="0" w:colLast="0"/>
-      <w:bookmarkEnd w:id="21"/>
-      <w:r>
+      <w:bookmarkStart w:id="19" w:name="_6q1d9hlo6qix" w:colFirst="0" w:colLast="0"/>
+      <w:bookmarkEnd w:id="19"/>
+      <w:r>
+        <w:t>Existing Process Flowchart</w:t>
+      </w:r>
+    </w:p>
+    <w:p>
+      <w:r>
+        <w:t>A flowchart is a graphical representation of a process that uses standardized symbols — such as rectangles for actions, diamonds for decisions, and arrows for flow direction — to illustrate the sequence of steps, decision points, and outcomes. Flowcharts are important in system analysis because they provide a clear, visual understanding of the current (as-is) process, making it easier to identify bottle</w:t>
+      </w:r>
+    </w:p>
+    <w:p>
+      <w:r>
+        <w:rPr>
+          <w:noProof/>
+        </w:rPr>
         <w:lastRenderedPageBreak/>
-        <w:t>Dataflow Diagram (DFD)</w:t>
-      </w:r>
-    </w:p>
-    <w:p>
-      <w:r>
-        <w:t>A Dataflow Diagram (DFD) is a graphical tool used to visualize how data moves through a system. It identifies where data originates (external entities), how it is processed (processes), where it is stored (data stores), and the paths it follows (data flows). DFDs are important in system design because they provide a clear, logical representation of the system's data handling without getting into implementation details, making it easier for both developers and stakeholders to validate that all data requirements are covered.</w:t>
-      </w:r>
-    </w:p>
+        <w:drawing>
+          <wp:anchor distT="0" distB="0" distL="114300" distR="114300" simplePos="0" relativeHeight="251659264" behindDoc="1" locked="0" layoutInCell="1" allowOverlap="1" wp14:anchorId="61037352" wp14:editId="7E1E2419">
+            <wp:simplePos x="0" y="0"/>
+            <wp:positionH relativeFrom="column">
+              <wp:posOffset>1771650</wp:posOffset>
+            </wp:positionH>
+            <wp:positionV relativeFrom="paragraph">
+              <wp:posOffset>189865</wp:posOffset>
+            </wp:positionV>
+            <wp:extent cx="1676400" cy="5154295"/>
+            <wp:effectExtent l="0" t="0" r="0" b="8255"/>
+            <wp:wrapTopAndBottom/>
+            <wp:docPr id="985403591" name="Picture 4"/>
+            <wp:cNvGraphicFramePr>
+              <a:graphicFrameLocks xmlns:a="http://schemas.openxmlformats.org/drawingml/2006/main" noChangeAspect="1"/>
+            </wp:cNvGraphicFramePr>
+            <a:graphic xmlns:a="http://schemas.openxmlformats.org/drawingml/2006/main">
+              <a:graphicData uri="http://schemas.openxmlformats.org/drawingml/2006/picture">
+                <pic:pic xmlns:pic="http://schemas.openxmlformats.org/drawingml/2006/picture">
+                  <pic:nvPicPr>
+                    <pic:cNvPr id="985403591" name=""/>
+                    <pic:cNvPicPr/>
+                  </pic:nvPicPr>
+                  <pic:blipFill>
+                    <a:blip r:embed="rId11" cstate="print">
+                      <a:extLst>
+                        <a:ext uri="{28A0092B-C50C-407E-A947-70E740481C1C}">
+                          <a14:useLocalDpi xmlns:a14="http://schemas.microsoft.com/office/drawing/2010/main" val="0"/>
+                        </a:ext>
+                      </a:extLst>
+                    </a:blip>
+                    <a:stretch>
+                      <a:fillRect/>
+                    </a:stretch>
+                  </pic:blipFill>
+                  <pic:spPr>
+                    <a:xfrm>
+                      <a:off x="0" y="0"/>
+                      <a:ext cx="1676400" cy="5154295"/>
+                    </a:xfrm>
+                    <a:prstGeom prst="rect">
+                      <a:avLst/>
+                    </a:prstGeom>
+                  </pic:spPr>
+                </pic:pic>
+              </a:graphicData>
+            </a:graphic>
+          </wp:anchor>
+        </w:drawing>
+      </w:r>
+    </w:p>
+    <w:p/>
     <w:p>
       <w:pPr>
         <w:widowControl w:val="0"/>
@@ -2407,42 +2595,15 @@
     </w:p>
     <w:p>
       <w:r>
-        <w:t xml:space="preserve">The DFD details the interactions between the main external entities and the system processes. </w:t>
-      </w:r>
-      <w:r>
-        <w:rPr>
-          <w:b/>
-          <w:bCs/>
-        </w:rPr>
-        <w:t>General Public and Academic Users (EE1)</w:t>
-      </w:r>
-      <w:r>
-        <w:t xml:space="preserve">, including tourists and researchers, send search queries and browse requests to Process 1.0 (Search &amp; Browse), which forwards these to the Main System. Process 4.0 (Data Retrieval &amp; Display) retrieves map data, points of interest details, and cultural profiles from the system and returns them to the user. </w:t>
-      </w:r>
-      <w:r>
-        <w:rPr>
-          <w:b/>
-          <w:bCs/>
-        </w:rPr>
-        <w:t>Administrative and Stakeholder Users (EE2)</w:t>
-      </w:r>
-      <w:r>
-        <w:t xml:space="preserve"> submit new content and manage system data. This entity encompasses Barangay Representatives who submit content through Process 2.0 (Content Submission) and LGU Tourism Admins who interact with Process 3.0 (Content Moderation) to review and approve submissions. Process 3.0 either commits the approved data to Data Store D2 (Tourist Spots &amp; Cultural Data) or sends a rejection notice. The system also maintains Data Store D1 (User Accounts &amp; Roles) for authentication and access control across all categories.</w:t>
-      </w:r>
-    </w:p>
-    <w:p>
-      <w:pPr>
-        <w:pStyle w:val="Heading3"/>
-      </w:pPr>
-      <w:bookmarkStart w:id="22" w:name="_kzif9yln8zpo" w:colFirst="0" w:colLast="0"/>
-      <w:bookmarkEnd w:id="22"/>
-      <w:r>
-        <w:t>Entity-Relationship Diagram (ERD)</w:t>
-      </w:r>
-    </w:p>
-    <w:p>
-      <w:r>
-        <w:t>An Entity-Relationship Diagram (ERD) visually represents the logical structure of a database by defining the entities (tables), their attributes (columns), and the relationships that connect them. ERDs are important in database design because they provide a clear, conceptual blueprint of how data is organized, ensuring data integrity, eliminating redundancy, and establishing the foundation for writing efficient database queries.</w:t>
+        <w:t xml:space="preserve">The flowchart illustrates the two primary manual processes currently used in </w:t>
+      </w:r>
+      <w:proofErr w:type="spellStart"/>
+      <w:r>
+        <w:t>Mangatarem</w:t>
+      </w:r>
+      <w:proofErr w:type="spellEnd"/>
+      <w:r>
+        <w:t>, revealing significant gaps in information accessibility and data synchronization. The first process (Top Path) begins when a tourist seeks information. Currently, the tourist is forced to choose between searching unverified social media pages—which often harbor outdated or conflicting details leading to visitor confusion—or traveling physically to the Municipal Tourism Office. At the office, staff must manually browse through paper-bound records and physical files to answer inquiries. If the relevant file is missing or being used by another officer, the information remains unavailable, resulting in a poor visitor experience.</w:t>
       </w:r>
     </w:p>
     <w:p>
@@ -2459,6 +2620,242 @@
     </w:p>
     <w:p>
       <w:r>
+        <w:t xml:space="preserve">The second process (Bottom Path) describes the current information reporting workflow from the grassroots level. When a Barangay Representative has a new cultural event or attraction update, they must either prepare a physical report for delivery or send informal messages via text or social media. This non-standardized communication forces LGU Tourism staff to </w:t>
+      </w:r>
+      <w:r>
+        <w:lastRenderedPageBreak/>
+        <w:t>manually consolidate disparate data formats. Any missing information necessitates a repetitive cycle of phone calls and follow-ups, causing significant time lags. By the time the LGU updates its printed brochures or social media posts, the information is often already weeks old. This flowchart demonstrates that the current reliance on manual, physical-first documentation is the root cause of the municipality's fragmented and delay-prone tourism information ecosystem.</w:t>
+      </w:r>
+    </w:p>
+    <w:p>
+      <w:pPr>
+        <w:pStyle w:val="Heading3"/>
+      </w:pPr>
+      <w:bookmarkStart w:id="20" w:name="_s2higp4eiy85" w:colFirst="0" w:colLast="0"/>
+      <w:bookmarkEnd w:id="20"/>
+      <w:r>
+        <w:t>Dataflow Diagram (DFD)</w:t>
+      </w:r>
+    </w:p>
+    <w:p>
+      <w:r>
+        <w:t>A Dataflow Diagram (DFD) is a graphical tool used to visualize how data moves through a system. It identifies where data originates (external entities), how it is processed (processes), where it is stored (data stores), and the paths it follows (data flows). DFDs are important in system design because they provide a clear, logical representation of the system's data handling without getting into implementation details, making it easier for both developers and stakeholders to validate that all data requirements are covered.</w:t>
+      </w:r>
+    </w:p>
+    <w:p>
+      <w:pPr>
+        <w:widowControl w:val="0"/>
+        <w:pBdr>
+          <w:top w:val="nil"/>
+          <w:left w:val="nil"/>
+          <w:bottom w:val="nil"/>
+          <w:right w:val="nil"/>
+          <w:between w:val="nil"/>
+        </w:pBdr>
+      </w:pPr>
+    </w:p>
+    <w:p>
+      <w:pPr>
+        <w:widowControl w:val="0"/>
+        <w:pBdr>
+          <w:top w:val="nil"/>
+          <w:left w:val="nil"/>
+          <w:bottom w:val="nil"/>
+          <w:right w:val="nil"/>
+          <w:between w:val="nil"/>
+        </w:pBdr>
+      </w:pPr>
+      <w:r>
+        <w:rPr>
+          <w:noProof/>
+        </w:rPr>
+        <w:drawing>
+          <wp:inline distT="0" distB="0" distL="0" distR="0" wp14:anchorId="27F0E5E5" wp14:editId="2F55800C">
+            <wp:extent cx="5943600" cy="3861435"/>
+            <wp:effectExtent l="0" t="0" r="0" b="5715"/>
+            <wp:docPr id="195297201" name="Picture 6"/>
+            <wp:cNvGraphicFramePr>
+              <a:graphicFrameLocks xmlns:a="http://schemas.openxmlformats.org/drawingml/2006/main" noChangeAspect="1"/>
+            </wp:cNvGraphicFramePr>
+            <a:graphic xmlns:a="http://schemas.openxmlformats.org/drawingml/2006/main">
+              <a:graphicData uri="http://schemas.openxmlformats.org/drawingml/2006/picture">
+                <pic:pic xmlns:pic="http://schemas.openxmlformats.org/drawingml/2006/picture">
+                  <pic:nvPicPr>
+                    <pic:cNvPr id="195297201" name=""/>
+                    <pic:cNvPicPr/>
+                  </pic:nvPicPr>
+                  <pic:blipFill>
+                    <a:blip r:embed="rId12" cstate="print">
+                      <a:extLst>
+                        <a:ext uri="{28A0092B-C50C-407E-A947-70E740481C1C}">
+                          <a14:useLocalDpi xmlns:a14="http://schemas.microsoft.com/office/drawing/2010/main" val="0"/>
+                        </a:ext>
+                      </a:extLst>
+                    </a:blip>
+                    <a:stretch>
+                      <a:fillRect/>
+                    </a:stretch>
+                  </pic:blipFill>
+                  <pic:spPr>
+                    <a:xfrm>
+                      <a:off x="0" y="0"/>
+                      <a:ext cx="5943600" cy="3861435"/>
+                    </a:xfrm>
+                    <a:prstGeom prst="rect">
+                      <a:avLst/>
+                    </a:prstGeom>
+                  </pic:spPr>
+                </pic:pic>
+              </a:graphicData>
+            </a:graphic>
+          </wp:inline>
+        </w:drawing>
+      </w:r>
+    </w:p>
+    <w:p>
+      <w:pPr>
+        <w:widowControl w:val="0"/>
+        <w:pBdr>
+          <w:top w:val="nil"/>
+          <w:left w:val="nil"/>
+          <w:bottom w:val="nil"/>
+          <w:right w:val="nil"/>
+          <w:between w:val="nil"/>
+        </w:pBdr>
+      </w:pPr>
+    </w:p>
+    <w:p>
+      <w:pPr>
+        <w:widowControl w:val="0"/>
+        <w:pBdr>
+          <w:top w:val="nil"/>
+          <w:left w:val="nil"/>
+          <w:bottom w:val="nil"/>
+          <w:right w:val="nil"/>
+          <w:between w:val="nil"/>
+        </w:pBdr>
+      </w:pPr>
+    </w:p>
+    <w:p>
+      <w:r>
+        <w:t xml:space="preserve">The DFD details the interactions between the main external entities and the system processes. </w:t>
+      </w:r>
+      <w:r>
+        <w:rPr>
+          <w:b/>
+          <w:bCs/>
+        </w:rPr>
+        <w:t>General Public and Academic Users (EE1)</w:t>
+      </w:r>
+      <w:r>
+        <w:t xml:space="preserve">, including tourists and researchers, send search queries and browse requests to Process 1.0 (Search &amp; Browse), which forwards these to the Main System. Process 4.0 (Data Retrieval &amp; Display) retrieves map data, points of interest details, and cultural profiles from the system and returns them to the user. </w:t>
+      </w:r>
+      <w:r>
+        <w:rPr>
+          <w:b/>
+          <w:bCs/>
+        </w:rPr>
+        <w:t>Administrative and Stakeholder Users (EE2)</w:t>
+      </w:r>
+      <w:r>
+        <w:t xml:space="preserve"> submit new content and manage system data. This entity </w:t>
+      </w:r>
+      <w:r>
+        <w:lastRenderedPageBreak/>
+        <w:t>encompasses Barangay Representatives who submit content through Process 2.0 (Content Submission) and LGU Tourism Admins who interact with Process 3.0 (Content Moderation) to review and approve submissions. Process 3.0 either commits the approved data to Data Store D2 (Tourist Spots &amp; Cultural Data) or sends a rejection notice. The system also maintains Data Store D1 (User Accounts &amp; Roles) for authentication and access control across all categories.</w:t>
+      </w:r>
+    </w:p>
+    <w:p>
+      <w:pPr>
+        <w:pStyle w:val="Heading3"/>
+      </w:pPr>
+      <w:bookmarkStart w:id="21" w:name="_kzif9yln8zpo" w:colFirst="0" w:colLast="0"/>
+      <w:bookmarkEnd w:id="21"/>
+      <w:r>
+        <w:t>Entity-Relationship Diagram (ERD)</w:t>
+      </w:r>
+    </w:p>
+    <w:p>
+      <w:r>
+        <w:t>An Entity-Relationship Diagram (ERD) visually represents the logical structure of a database by defining the entities (tables), their attributes (columns), and the relationships that connect them. ERDs are important in database design because they provide a clear, conceptual blueprint of how data is organized, ensuring data integrity, eliminating redundancy, and establishing the foundation for writing efficient database queries.</w:t>
+      </w:r>
+    </w:p>
+    <w:p>
+      <w:pPr>
+        <w:widowControl w:val="0"/>
+        <w:pBdr>
+          <w:top w:val="nil"/>
+          <w:left w:val="nil"/>
+          <w:bottom w:val="nil"/>
+          <w:right w:val="nil"/>
+          <w:between w:val="nil"/>
+        </w:pBdr>
+      </w:pPr>
+    </w:p>
+    <w:p/>
+    <w:p/>
+    <w:p/>
+    <w:p/>
+    <w:p>
+      <w:r>
+        <w:rPr>
+          <w:noProof/>
+        </w:rPr>
+        <w:lastRenderedPageBreak/>
+        <w:drawing>
+          <wp:inline distT="0" distB="0" distL="0" distR="0" wp14:anchorId="08613C99" wp14:editId="04DD0D57">
+            <wp:extent cx="5934075" cy="6000750"/>
+            <wp:effectExtent l="0" t="0" r="9525" b="0"/>
+            <wp:docPr id="1506887257" name="Picture 10"/>
+            <wp:cNvGraphicFramePr>
+              <a:graphicFrameLocks xmlns:a="http://schemas.openxmlformats.org/drawingml/2006/main" noChangeAspect="1"/>
+            </wp:cNvGraphicFramePr>
+            <a:graphic xmlns:a="http://schemas.openxmlformats.org/drawingml/2006/main">
+              <a:graphicData uri="http://schemas.openxmlformats.org/drawingml/2006/picture">
+                <pic:pic xmlns:pic="http://schemas.openxmlformats.org/drawingml/2006/picture">
+                  <pic:nvPicPr>
+                    <pic:cNvPr id="0" name="Picture 1"/>
+                    <pic:cNvPicPr>
+                      <a:picLocks noChangeAspect="1" noChangeArrowheads="1"/>
+                    </pic:cNvPicPr>
+                  </pic:nvPicPr>
+                  <pic:blipFill>
+                    <a:blip r:embed="rId13" cstate="print">
+                      <a:extLst>
+                        <a:ext uri="{28A0092B-C50C-407E-A947-70E740481C1C}">
+                          <a14:useLocalDpi xmlns:a14="http://schemas.microsoft.com/office/drawing/2010/main" val="0"/>
+                        </a:ext>
+                      </a:extLst>
+                    </a:blip>
+                    <a:srcRect/>
+                    <a:stretch>
+                      <a:fillRect/>
+                    </a:stretch>
+                  </pic:blipFill>
+                  <pic:spPr bwMode="auto">
+                    <a:xfrm>
+                      <a:off x="0" y="0"/>
+                      <a:ext cx="5934075" cy="6000750"/>
+                    </a:xfrm>
+                    <a:prstGeom prst="rect">
+                      <a:avLst/>
+                    </a:prstGeom>
+                    <a:noFill/>
+                    <a:ln>
+                      <a:noFill/>
+                    </a:ln>
+                  </pic:spPr>
+                </pic:pic>
+              </a:graphicData>
+            </a:graphic>
+          </wp:inline>
+        </w:drawing>
+      </w:r>
+    </w:p>
+    <w:p/>
+    <w:p/>
+    <w:p>
+      <w:r>
         <w:t xml:space="preserve">The ERD illustrates the comprehensive data structure of the system, which has evolved beyond simple tourism pins to a full heritage and business management ecosystem. The </w:t>
       </w:r>
       <w:r>
@@ -2509,13 +2906,18 @@
         <w:t>EVENT</w:t>
       </w:r>
       <w:r>
-        <w:t xml:space="preserve"> entity manages the municipality's cultural calendar. To support local commerce, the </w:t>
-      </w:r>
-      <w:r>
-        <w:rPr>
-          <w:b/>
-          <w:bCs/>
-        </w:rPr>
+        <w:t xml:space="preserve"> entity manages the municipality's cultural calendar. To support local commerce, the</w:t>
+      </w:r>
+    </w:p>
+    <w:p/>
+    <w:p/>
+    <w:p>
+      <w:r>
+        <w:rPr>
+          <w:b/>
+          <w:bCs/>
+        </w:rPr>
+        <w:lastRenderedPageBreak/>
         <w:t>ESTABLISHMENT</w:t>
       </w:r>
       <w:r>
@@ -2539,26 +2941,14 @@
         <w:t>ESTABLISHMENT_MENU_ITEM</w:t>
       </w:r>
       <w:r>
-        <w:t xml:space="preserve">. Finally, </w:t>
-      </w:r>
-      <w:proofErr w:type="gramStart"/>
-      <w:r>
-        <w:t xml:space="preserve">the </w:t>
-      </w:r>
-      <w:r>
-        <w:rPr>
-          <w:b/>
-          <w:bCs/>
-        </w:rPr>
-        <w:t>DATABASE</w:t>
-      </w:r>
-      <w:proofErr w:type="gramEnd"/>
-      <w:r>
-        <w:rPr>
-          <w:b/>
-          <w:bCs/>
-        </w:rPr>
-        <w:t>_AUDIT_LOG</w:t>
+        <w:t xml:space="preserve">. Finally, the </w:t>
+      </w:r>
+      <w:r>
+        <w:rPr>
+          <w:b/>
+          <w:bCs/>
+        </w:rPr>
+        <w:t>DATABASE_AUDIT_LOG</w:t>
       </w:r>
       <w:r>
         <w:t xml:space="preserve"> ensures security and accountability by tracking all administrative actions. This relational structure ensures that cultural data is preserved with high integrity while providing a flexible foundation for tourism promotion.</w:t>
@@ -2568,39 +2958,87 @@
       <w:pPr>
         <w:pStyle w:val="Heading3"/>
       </w:pPr>
-      <w:bookmarkStart w:id="23" w:name="_puy3riw1fngf" w:colFirst="0" w:colLast="0"/>
+      <w:bookmarkStart w:id="22" w:name="_puy3riw1fngf" w:colFirst="0" w:colLast="0"/>
+      <w:bookmarkEnd w:id="22"/>
+      <w:r>
+        <w:t>Implementation Plan</w:t>
+      </w:r>
+    </w:p>
+    <w:p>
+      <w:r>
+        <w:t>The successful deployment of the Interactive Digital Cultural Map and Local Tourism Information System requires a structured implementation plan encompassing a project timeline, a deployment strategy, and a clear definition of resource requirements.</w:t>
+      </w:r>
+    </w:p>
+    <w:p>
+      <w:pPr>
+        <w:pStyle w:val="Heading4"/>
+      </w:pPr>
+      <w:bookmarkStart w:id="23" w:name="_bl3add453chm" w:colFirst="0" w:colLast="0"/>
       <w:bookmarkEnd w:id="23"/>
       <w:r>
-        <w:lastRenderedPageBreak/>
-        <w:t>Implementation Plan</w:t>
-      </w:r>
-    </w:p>
-    <w:p>
-      <w:r>
-        <w:t>The successful deployment of the Interactive Digital Cultural Map and Local Tourism Information System requires a structured implementation plan encompassing a project timeline, a deployment strategy, and a clear definition of resource requirements.</w:t>
+        <w:t>Project Timeline</w:t>
+      </w:r>
+    </w:p>
+    <w:p>
+      <w:r>
+        <w:t>The development schedule is organized around the four phases of the RAD methodology, with key milestones and expected completion dates for each phase.</w:t>
+      </w:r>
+    </w:p>
+    <w:p/>
+    <w:p>
+      <w:r>
+        <w:rPr>
+          <w:noProof/>
+        </w:rPr>
+        <w:drawing>
+          <wp:inline distT="0" distB="0" distL="0" distR="0" wp14:anchorId="70ED24E0" wp14:editId="137DBFEB">
+            <wp:extent cx="5943600" cy="1379220"/>
+            <wp:effectExtent l="0" t="0" r="0" b="0"/>
+            <wp:docPr id="982001922" name="Picture 11"/>
+            <wp:cNvGraphicFramePr>
+              <a:graphicFrameLocks xmlns:a="http://schemas.openxmlformats.org/drawingml/2006/main" noChangeAspect="1"/>
+            </wp:cNvGraphicFramePr>
+            <a:graphic xmlns:a="http://schemas.openxmlformats.org/drawingml/2006/main">
+              <a:graphicData uri="http://schemas.openxmlformats.org/drawingml/2006/picture">
+                <pic:pic xmlns:pic="http://schemas.openxmlformats.org/drawingml/2006/picture">
+                  <pic:nvPicPr>
+                    <pic:cNvPr id="982001922" name=""/>
+                    <pic:cNvPicPr/>
+                  </pic:nvPicPr>
+                  <pic:blipFill>
+                    <a:blip r:embed="rId14" cstate="print">
+                      <a:extLst>
+                        <a:ext uri="{28A0092B-C50C-407E-A947-70E740481C1C}">
+                          <a14:useLocalDpi xmlns:a14="http://schemas.microsoft.com/office/drawing/2010/main" val="0"/>
+                        </a:ext>
+                      </a:extLst>
+                    </a:blip>
+                    <a:stretch>
+                      <a:fillRect/>
+                    </a:stretch>
+                  </pic:blipFill>
+                  <pic:spPr>
+                    <a:xfrm>
+                      <a:off x="0" y="0"/>
+                      <a:ext cx="5943600" cy="1379220"/>
+                    </a:xfrm>
+                    <a:prstGeom prst="rect">
+                      <a:avLst/>
+                    </a:prstGeom>
+                  </pic:spPr>
+                </pic:pic>
+              </a:graphicData>
+            </a:graphic>
+          </wp:inline>
+        </w:drawing>
       </w:r>
     </w:p>
     <w:p>
       <w:pPr>
         <w:pStyle w:val="Heading4"/>
       </w:pPr>
-      <w:bookmarkStart w:id="24" w:name="_bl3add453chm" w:colFirst="0" w:colLast="0"/>
+      <w:bookmarkStart w:id="24" w:name="_bsc7ykd6pqyo" w:colFirst="0" w:colLast="0"/>
       <w:bookmarkEnd w:id="24"/>
-      <w:r>
-        <w:t>Project Timeline</w:t>
-      </w:r>
-    </w:p>
-    <w:p>
-      <w:r>
-        <w:t>The development schedule is organized around the four phases of the RAD methodology, with key milestones and expected completion dates for each phase.</w:t>
-      </w:r>
-    </w:p>
-    <w:p>
-      <w:pPr>
-        <w:pStyle w:val="Heading4"/>
-      </w:pPr>
-      <w:bookmarkStart w:id="25" w:name="_bsc7ykd6pqyo" w:colFirst="0" w:colLast="0"/>
-      <w:bookmarkEnd w:id="25"/>
       <w:r>
         <w:t>Deployment Plan</w:t>
       </w:r>
@@ -2747,6 +3185,7 @@
           <w:b/>
           <w:bCs/>
         </w:rPr>
+        <w:lastRenderedPageBreak/>
         <w:t>User Training and Launch:</w:t>
       </w:r>
       <w:r>
@@ -2788,8 +3227,8 @@
       <w:pPr>
         <w:pStyle w:val="Heading4"/>
       </w:pPr>
-      <w:bookmarkStart w:id="26" w:name="_su7ide11rbd5" w:colFirst="0" w:colLast="0"/>
-      <w:bookmarkEnd w:id="26"/>
+      <w:bookmarkStart w:id="25" w:name="_su7ide11rbd5" w:colFirst="0" w:colLast="0"/>
+      <w:bookmarkEnd w:id="25"/>
       <w:r>
         <w:t>Resource Requirements</w:t>
       </w:r>
@@ -3052,6 +3491,7 @@
           <w:b/>
           <w:bCs/>
         </w:rPr>
+        <w:lastRenderedPageBreak/>
         <w:t>Category 2: General Public and Academic Users</w:t>
       </w:r>
       <w:r>
@@ -3086,35 +3526,31 @@
       <w:pPr>
         <w:pStyle w:val="Heading1"/>
       </w:pPr>
-      <w:bookmarkStart w:id="27" w:name="_lsyn3786vgug" w:colFirst="0" w:colLast="0"/>
+      <w:bookmarkStart w:id="26" w:name="_lsyn3786vgug" w:colFirst="0" w:colLast="0"/>
+      <w:bookmarkEnd w:id="26"/>
+      <w:r>
+        <w:t>Chapter 3: Results and Discussion</w:t>
+      </w:r>
+    </w:p>
+    <w:p>
+      <w:r>
+        <w:t xml:space="preserve">This chapter provides a comprehensive exposition of the outcomes derived from the development, deployment, and rigorous evaluation of the Interactive Digital Cultural Map and Local Tourism Information System for </w:t>
+      </w:r>
+      <w:proofErr w:type="spellStart"/>
+      <w:r>
+        <w:t>Mangatarem</w:t>
+      </w:r>
+      <w:proofErr w:type="spellEnd"/>
+      <w:r>
+        <w:t>, Pangasinan. It encapsulates the empirical evidence gathered during the terminal phase of the project, detailing the operational features of the system, the systemic testing methodologies employed to ensure technical integrity, and a synthesized analysis of the results. By bridging the gap between theoretical system design and practical implementation, this chapter validates the system’s efficacy in addressing the municipality's fragmented tourism information ecosystem.</w:t>
+      </w:r>
+    </w:p>
+    <w:p>
+      <w:pPr>
+        <w:pStyle w:val="Heading2"/>
+      </w:pPr>
+      <w:bookmarkStart w:id="27" w:name="_eruma6jzdi4" w:colFirst="0" w:colLast="0"/>
       <w:bookmarkEnd w:id="27"/>
-      <w:r>
-        <w:t>Chapter 3: Results and Discussion</w:t>
-      </w:r>
-    </w:p>
-    <w:p>
-      <w:r>
-        <w:t xml:space="preserve">This chapter provides a comprehensive exposition of the outcomes derived from the development, deployment, and rigorous evaluation of the Interactive Digital Cultural Map and Local Tourism Information System for </w:t>
-      </w:r>
-      <w:proofErr w:type="spellStart"/>
-      <w:r>
-        <w:t>Mangatarem</w:t>
-      </w:r>
-      <w:proofErr w:type="spellEnd"/>
-      <w:r>
-        <w:t xml:space="preserve">, Pangasinan. It encapsulates the empirical evidence gathered during the terminal phase of the project, detailing the operational features of the system, the systemic testing methodologies employed to ensure technical integrity, and a </w:t>
-      </w:r>
-      <w:r>
-        <w:lastRenderedPageBreak/>
-        <w:t>synthesized analysis of the results. By bridging the gap between theoretical system design and practical implementation, this chapter validates the system’s efficacy in addressing the municipality's fragmented tourism information ecosystem.</w:t>
-      </w:r>
-    </w:p>
-    <w:p>
-      <w:pPr>
-        <w:pStyle w:val="Heading2"/>
-      </w:pPr>
-      <w:bookmarkStart w:id="28" w:name="_eruma6jzdi4" w:colFirst="0" w:colLast="0"/>
-      <w:bookmarkEnd w:id="28"/>
       <w:r>
         <w:t>Proposed System Flowchart</w:t>
       </w:r>
@@ -3250,24 +3686,25 @@
       <w:pPr>
         <w:pStyle w:val="Heading2"/>
       </w:pPr>
-      <w:bookmarkStart w:id="29" w:name="_tny1huq536ye" w:colFirst="0" w:colLast="0"/>
+      <w:bookmarkStart w:id="28" w:name="_tny1huq536ye" w:colFirst="0" w:colLast="0"/>
+      <w:bookmarkEnd w:id="28"/>
+      <w:r>
+        <w:t>System Features and User Interfaces</w:t>
+      </w:r>
+    </w:p>
+    <w:p>
+      <w:r>
+        <w:t>The architecture of the system is distilled into two primary functional categories, each tailored to the specific requirements of its user ecosystem:</w:t>
+      </w:r>
+    </w:p>
+    <w:p>
+      <w:pPr>
+        <w:pStyle w:val="Heading3"/>
+      </w:pPr>
+      <w:bookmarkStart w:id="29" w:name="_ajn5n7wbr9ee" w:colFirst="0" w:colLast="0"/>
       <w:bookmarkEnd w:id="29"/>
       <w:r>
-        <w:t>System Features and User Interfaces</w:t>
-      </w:r>
-    </w:p>
-    <w:p>
-      <w:r>
-        <w:t>The architecture of the system is distilled into two primary functional categories, each tailored to the specific requirements of its user ecosystem:</w:t>
-      </w:r>
-    </w:p>
-    <w:p>
-      <w:pPr>
-        <w:pStyle w:val="Heading3"/>
-      </w:pPr>
-      <w:bookmarkStart w:id="30" w:name="_ajn5n7wbr9ee" w:colFirst="0" w:colLast="0"/>
-      <w:bookmarkEnd w:id="30"/>
-      <w:r>
+        <w:lastRenderedPageBreak/>
         <w:t>1. General Public and Academic Portal</w:t>
       </w:r>
     </w:p>
@@ -3372,8 +3809,8 @@
       <w:pPr>
         <w:pStyle w:val="Heading3"/>
       </w:pPr>
-      <w:bookmarkStart w:id="31" w:name="_h6d7tebsyq1g" w:colFirst="0" w:colLast="0"/>
-      <w:bookmarkEnd w:id="31"/>
+      <w:bookmarkStart w:id="30" w:name="_h6d7tebsyq1g" w:colFirst="0" w:colLast="0"/>
+      <w:bookmarkEnd w:id="30"/>
       <w:r>
         <w:t>2. Administrative and Stakeholder Portal</w:t>
       </w:r>
@@ -3445,7 +3882,6 @@
           <w:b/>
           <w:bCs/>
         </w:rPr>
-        <w:lastRenderedPageBreak/>
         <w:t>UI Description:</w:t>
       </w:r>
       <w:r>
@@ -3456,23 +3892,23 @@
       <w:pPr>
         <w:pStyle w:val="Heading2"/>
       </w:pPr>
-      <w:bookmarkStart w:id="32" w:name="_biyyi7f93l7c" w:colFirst="0" w:colLast="0"/>
+      <w:bookmarkStart w:id="31" w:name="_biyyi7f93l7c" w:colFirst="0" w:colLast="0"/>
+      <w:bookmarkEnd w:id="31"/>
+      <w:r>
+        <w:t>System Testing and Evaluation</w:t>
+      </w:r>
+    </w:p>
+    <w:p>
+      <w:r>
+        <w:t>To ensure the technical robustness and organizational relevance of the system, a multi-phased testing strategy was executed, grounded in the ISO/IEC 25010 software quality standards.</w:t>
+      </w:r>
+    </w:p>
+    <w:p>
+      <w:pPr>
+        <w:pStyle w:val="Heading3"/>
+      </w:pPr>
+      <w:bookmarkStart w:id="32" w:name="_a70ggq25urtt" w:colFirst="0" w:colLast="0"/>
       <w:bookmarkEnd w:id="32"/>
-      <w:r>
-        <w:t>System Testing and Evaluation</w:t>
-      </w:r>
-    </w:p>
-    <w:p>
-      <w:r>
-        <w:t>To ensure the technical robustness and organizational relevance of the system, a multi-phased testing strategy was executed, grounded in the ISO/IEC 25010 software quality standards.</w:t>
-      </w:r>
-    </w:p>
-    <w:p>
-      <w:pPr>
-        <w:pStyle w:val="Heading3"/>
-      </w:pPr>
-      <w:bookmarkStart w:id="33" w:name="_a70ggq25urtt" w:colFirst="0" w:colLast="0"/>
-      <w:bookmarkEnd w:id="33"/>
       <w:r>
         <w:t>Functional Testing</w:t>
       </w:r>
@@ -3583,15 +4019,7 @@
         <w:t>Moderation Workflow:</w:t>
       </w:r>
       <w:r>
-        <w:t xml:space="preserve"> Verifying the state transitions from "Pending" </w:t>
-      </w:r>
-      <w:proofErr w:type="gramStart"/>
-      <w:r>
-        <w:t>to</w:t>
-      </w:r>
-      <w:proofErr w:type="gramEnd"/>
-      <w:r>
-        <w:t xml:space="preserve"> "Approved".</w:t>
+        <w:t xml:space="preserve"> Verifying the state transitions from "Pending" to "Approved".</w:t>
       </w:r>
     </w:p>
     <w:p>
@@ -3640,9 +4068,10 @@
       <w:pPr>
         <w:pStyle w:val="Heading3"/>
       </w:pPr>
-      <w:bookmarkStart w:id="34" w:name="_xx2qo3oisqdf" w:colFirst="0" w:colLast="0"/>
-      <w:bookmarkEnd w:id="34"/>
-      <w:r>
+      <w:bookmarkStart w:id="33" w:name="_xx2qo3oisqdf" w:colFirst="0" w:colLast="0"/>
+      <w:bookmarkEnd w:id="33"/>
+      <w:r>
+        <w:lastRenderedPageBreak/>
         <w:t>Performance Testing</w:t>
       </w:r>
     </w:p>
@@ -3714,8 +4143,8 @@
       <w:pPr>
         <w:pStyle w:val="Heading3"/>
       </w:pPr>
-      <w:bookmarkStart w:id="35" w:name="_7h3cdglexfdk" w:colFirst="0" w:colLast="0"/>
-      <w:bookmarkEnd w:id="35"/>
+      <w:bookmarkStart w:id="34" w:name="_7h3cdglexfdk" w:colFirst="0" w:colLast="0"/>
+      <w:bookmarkEnd w:id="34"/>
       <w:r>
         <w:t>Security Testing</w:t>
       </w:r>
@@ -3778,10 +4207,9 @@
       <w:pPr>
         <w:pStyle w:val="Heading3"/>
       </w:pPr>
-      <w:bookmarkStart w:id="36" w:name="_h4lh9ygolf86" w:colFirst="0" w:colLast="0"/>
-      <w:bookmarkEnd w:id="36"/>
-      <w:r>
-        <w:lastRenderedPageBreak/>
+      <w:bookmarkStart w:id="35" w:name="_h4lh9ygolf86" w:colFirst="0" w:colLast="0"/>
+      <w:bookmarkEnd w:id="35"/>
+      <w:r>
         <w:t>Usability Testing</w:t>
       </w:r>
     </w:p>
@@ -3825,91 +4253,86 @@
       <w:pPr>
         <w:pStyle w:val="Heading2"/>
       </w:pPr>
-      <w:bookmarkStart w:id="37" w:name="_ymg7wlnm1pfi" w:colFirst="0" w:colLast="0"/>
+      <w:bookmarkStart w:id="36" w:name="_ymg7wlnm1pfi" w:colFirst="0" w:colLast="0"/>
+      <w:bookmarkEnd w:id="36"/>
+      <w:r>
+        <w:t>Implementation Results</w:t>
+      </w:r>
+    </w:p>
+    <w:p>
+      <w:r>
+        <w:t xml:space="preserve">The system was successfully deployed on </w:t>
+      </w:r>
+      <w:proofErr w:type="spellStart"/>
+      <w:r>
+        <w:rPr>
+          <w:b/>
+          <w:bCs/>
+        </w:rPr>
+        <w:t>Vercel</w:t>
+      </w:r>
+      <w:proofErr w:type="spellEnd"/>
+      <w:r>
+        <w:t xml:space="preserve"> with a managed </w:t>
+      </w:r>
+      <w:proofErr w:type="spellStart"/>
+      <w:r>
+        <w:rPr>
+          <w:b/>
+          <w:bCs/>
+        </w:rPr>
+        <w:t>Supabase</w:t>
+      </w:r>
+      <w:proofErr w:type="spellEnd"/>
+      <w:r>
+        <w:rPr>
+          <w:b/>
+          <w:bCs/>
+        </w:rPr>
+        <w:t xml:space="preserve"> (PostgreSQL)</w:t>
+      </w:r>
+      <w:r>
+        <w:t xml:space="preserve"> backend. Technical challenges such as serverless "cold starts" were mitigated through lazy initialization patterns, and database efficiency was maintained using </w:t>
+      </w:r>
+      <w:proofErr w:type="spellStart"/>
+      <w:r>
+        <w:rPr>
+          <w:b/>
+          <w:bCs/>
+        </w:rPr>
+        <w:t>Upstash</w:t>
+      </w:r>
+      <w:proofErr w:type="spellEnd"/>
+      <w:r>
+        <w:rPr>
+          <w:b/>
+          <w:bCs/>
+        </w:rPr>
+        <w:t xml:space="preserve"> Redis</w:t>
+      </w:r>
+      <w:r>
+        <w:t xml:space="preserve"> for map-data caching.</w:t>
+      </w:r>
+    </w:p>
+    <w:p/>
+    <w:p/>
+    <w:p>
+      <w:pPr>
+        <w:pStyle w:val="Heading2"/>
+      </w:pPr>
+      <w:bookmarkStart w:id="37" w:name="_uth85mghxkjp" w:colFirst="0" w:colLast="0"/>
       <w:bookmarkEnd w:id="37"/>
       <w:r>
-        <w:t>Implementation Results</w:t>
-      </w:r>
-    </w:p>
-    <w:p>
-      <w:r>
-        <w:t xml:space="preserve">The system was successfully deployed on </w:t>
-      </w:r>
-      <w:proofErr w:type="spellStart"/>
-      <w:r>
-        <w:rPr>
-          <w:b/>
-          <w:bCs/>
-        </w:rPr>
-        <w:t>Vercel</w:t>
-      </w:r>
-      <w:proofErr w:type="spellEnd"/>
-      <w:r>
-        <w:t xml:space="preserve"> with a managed </w:t>
-      </w:r>
-      <w:proofErr w:type="spellStart"/>
-      <w:r>
-        <w:rPr>
-          <w:b/>
-          <w:bCs/>
-        </w:rPr>
-        <w:t>Supabase</w:t>
-      </w:r>
-      <w:proofErr w:type="spellEnd"/>
-      <w:r>
-        <w:rPr>
-          <w:b/>
-          <w:bCs/>
-        </w:rPr>
-        <w:t xml:space="preserve"> (PostgreSQL)</w:t>
-      </w:r>
-      <w:r>
-        <w:t xml:space="preserve"> backend. Technical challenges such as serverless "cold starts" were mitigated through lazy initialization patterns, and database efficiency was maintained using </w:t>
-      </w:r>
-      <w:proofErr w:type="spellStart"/>
-      <w:r>
-        <w:rPr>
-          <w:b/>
-          <w:bCs/>
-        </w:rPr>
-        <w:t>Upstash</w:t>
-      </w:r>
-      <w:proofErr w:type="spellEnd"/>
-      <w:r>
-        <w:rPr>
-          <w:b/>
-          <w:bCs/>
-        </w:rPr>
-        <w:t xml:space="preserve"> Redis</w:t>
-      </w:r>
-      <w:r>
-        <w:t xml:space="preserve"> for map-data </w:t>
-      </w:r>
-      <w:proofErr w:type="gramStart"/>
-      <w:r>
-        <w:t>caching</w:t>
-      </w:r>
-      <w:proofErr w:type="gramEnd"/>
-      <w:r>
-        <w:t>.</w:t>
-      </w:r>
-    </w:p>
-    <w:p>
-      <w:pPr>
-        <w:pStyle w:val="Heading2"/>
-      </w:pPr>
-      <w:bookmarkStart w:id="38" w:name="_uth85mghxkjp" w:colFirst="0" w:colLast="0"/>
+        <w:lastRenderedPageBreak/>
+        <w:t>Analysis of Results</w:t>
+      </w:r>
+    </w:p>
+    <w:p>
+      <w:pPr>
+        <w:pStyle w:val="Heading3"/>
+      </w:pPr>
+      <w:bookmarkStart w:id="38" w:name="_6cdj1ycb3gx5" w:colFirst="0" w:colLast="0"/>
       <w:bookmarkEnd w:id="38"/>
-      <w:r>
-        <w:t>Analysis of Results</w:t>
-      </w:r>
-    </w:p>
-    <w:p>
-      <w:pPr>
-        <w:pStyle w:val="Heading3"/>
-      </w:pPr>
-      <w:bookmarkStart w:id="39" w:name="_6cdj1ycb3gx5" w:colFirst="0" w:colLast="0"/>
-      <w:bookmarkEnd w:id="39"/>
       <w:r>
         <w:t>Functional Testing Analysis</w:t>
       </w:r>
@@ -4436,10 +4859,9 @@
       <w:pPr>
         <w:pStyle w:val="Heading3"/>
       </w:pPr>
-      <w:bookmarkStart w:id="40" w:name="_uqmpejr5z0da" w:colFirst="0" w:colLast="0"/>
-      <w:bookmarkEnd w:id="40"/>
-      <w:r>
-        <w:lastRenderedPageBreak/>
+      <w:bookmarkStart w:id="39" w:name="_uqmpejr5z0da" w:colFirst="0" w:colLast="0"/>
+      <w:bookmarkEnd w:id="39"/>
+      <w:r>
         <w:t>Performance Testing Analysis</w:t>
       </w:r>
     </w:p>
@@ -4879,6 +5301,7 @@
           <w:b/>
           <w:bCs/>
         </w:rPr>
+        <w:lastRenderedPageBreak/>
         <w:t>Success Rate Calculation:</w:t>
       </w:r>
       <w:r>
@@ -4896,8 +5319,8 @@
       <w:pPr>
         <w:pStyle w:val="Heading3"/>
       </w:pPr>
-      <w:bookmarkStart w:id="41" w:name="_5t2re42uzxvd" w:colFirst="0" w:colLast="0"/>
-      <w:bookmarkEnd w:id="41"/>
+      <w:bookmarkStart w:id="40" w:name="_5t2re42uzxvd" w:colFirst="0" w:colLast="0"/>
+      <w:bookmarkEnd w:id="40"/>
       <w:r>
         <w:t>Security Testing Analysis</w:t>
       </w:r>
@@ -5347,10 +5770,9 @@
       <w:pPr>
         <w:pStyle w:val="Heading3"/>
       </w:pPr>
-      <w:bookmarkStart w:id="42" w:name="_z5h8hahyfn53" w:colFirst="0" w:colLast="0"/>
-      <w:bookmarkEnd w:id="42"/>
-      <w:r>
-        <w:lastRenderedPageBreak/>
+      <w:bookmarkStart w:id="41" w:name="_z5h8hahyfn53" w:colFirst="0" w:colLast="0"/>
+      <w:bookmarkEnd w:id="41"/>
+      <w:r>
         <w:t>Usability Testing Analysis</w:t>
       </w:r>
     </w:p>
@@ -5593,11 +6015,7 @@
               <w:right w:w="100" w:type="dxa"/>
             </w:tcMar>
           </w:tcPr>
-          <w:p>
-            <w:r>
-              <w:t>0</w:t>
-            </w:r>
-          </w:p>
+          <w:p/>
         </w:tc>
         <w:tc>
           <w:tcPr>
@@ -5609,11 +6027,7 @@
               <w:right w:w="100" w:type="dxa"/>
             </w:tcMar>
           </w:tcPr>
-          <w:p>
-            <w:r>
-              <w:t>0</w:t>
-            </w:r>
-          </w:p>
+          <w:p/>
         </w:tc>
         <w:tc>
           <w:tcPr>
@@ -5625,11 +6039,7 @@
               <w:right w:w="100" w:type="dxa"/>
             </w:tcMar>
           </w:tcPr>
-          <w:p>
-            <w:r>
-              <w:t>2</w:t>
-            </w:r>
-          </w:p>
+          <w:p/>
         </w:tc>
         <w:tc>
           <w:tcPr>
@@ -5641,11 +6051,7 @@
               <w:right w:w="100" w:type="dxa"/>
             </w:tcMar>
           </w:tcPr>
-          <w:p>
-            <w:r>
-              <w:t>8</w:t>
-            </w:r>
-          </w:p>
+          <w:p/>
         </w:tc>
         <w:tc>
           <w:tcPr>
@@ -5657,11 +6063,7 @@
               <w:right w:w="100" w:type="dxa"/>
             </w:tcMar>
           </w:tcPr>
-          <w:p>
-            <w:r>
-              <w:t>10</w:t>
-            </w:r>
-          </w:p>
+          <w:p/>
         </w:tc>
         <w:tc>
           <w:tcPr>
@@ -5673,15 +6075,7 @@
               <w:right w:w="100" w:type="dxa"/>
             </w:tcMar>
           </w:tcPr>
-          <w:p>
-            <w:r>
-              <w:rPr>
-                <w:b/>
-                <w:bCs/>
-              </w:rPr>
-              <w:t>4.4</w:t>
-            </w:r>
-          </w:p>
+          <w:p/>
         </w:tc>
       </w:tr>
       <w:tr>
@@ -5711,11 +6105,7 @@
               <w:right w:w="100" w:type="dxa"/>
             </w:tcMar>
           </w:tcPr>
-          <w:p>
-            <w:r>
-              <w:t>0</w:t>
-            </w:r>
-          </w:p>
+          <w:p/>
         </w:tc>
         <w:tc>
           <w:tcPr>
@@ -5727,11 +6117,7 @@
               <w:right w:w="100" w:type="dxa"/>
             </w:tcMar>
           </w:tcPr>
-          <w:p>
-            <w:r>
-              <w:t>1</w:t>
-            </w:r>
-          </w:p>
+          <w:p/>
         </w:tc>
         <w:tc>
           <w:tcPr>
@@ -5743,11 +6129,7 @@
               <w:right w:w="100" w:type="dxa"/>
             </w:tcMar>
           </w:tcPr>
-          <w:p>
-            <w:r>
-              <w:t>1</w:t>
-            </w:r>
-          </w:p>
+          <w:p/>
         </w:tc>
         <w:tc>
           <w:tcPr>
@@ -5759,11 +6141,7 @@
               <w:right w:w="100" w:type="dxa"/>
             </w:tcMar>
           </w:tcPr>
-          <w:p>
-            <w:r>
-              <w:t>9</w:t>
-            </w:r>
-          </w:p>
+          <w:p/>
         </w:tc>
         <w:tc>
           <w:tcPr>
@@ -5775,11 +6153,7 @@
               <w:right w:w="100" w:type="dxa"/>
             </w:tcMar>
           </w:tcPr>
-          <w:p>
-            <w:r>
-              <w:t>9</w:t>
-            </w:r>
-          </w:p>
+          <w:p/>
         </w:tc>
         <w:tc>
           <w:tcPr>
@@ -5791,15 +6165,7 @@
               <w:right w:w="100" w:type="dxa"/>
             </w:tcMar>
           </w:tcPr>
-          <w:p>
-            <w:r>
-              <w:rPr>
-                <w:b/>
-                <w:bCs/>
-              </w:rPr>
-              <w:t>4.3</w:t>
-            </w:r>
-          </w:p>
+          <w:p/>
         </w:tc>
       </w:tr>
       <w:tr>
@@ -5829,110 +6195,83 @@
               <w:right w:w="100" w:type="dxa"/>
             </w:tcMar>
           </w:tcPr>
+          <w:p/>
+        </w:tc>
+        <w:tc>
+          <w:tcPr>
+            <w:tcW w:w="1337" w:type="dxa"/>
+            <w:tcMar>
+              <w:top w:w="100" w:type="dxa"/>
+              <w:left w:w="100" w:type="dxa"/>
+              <w:bottom w:w="100" w:type="dxa"/>
+              <w:right w:w="100" w:type="dxa"/>
+            </w:tcMar>
+          </w:tcPr>
+          <w:p/>
+        </w:tc>
+        <w:tc>
+          <w:tcPr>
+            <w:tcW w:w="1337" w:type="dxa"/>
+            <w:tcMar>
+              <w:top w:w="100" w:type="dxa"/>
+              <w:left w:w="100" w:type="dxa"/>
+              <w:bottom w:w="100" w:type="dxa"/>
+              <w:right w:w="100" w:type="dxa"/>
+            </w:tcMar>
+          </w:tcPr>
+          <w:p/>
+        </w:tc>
+        <w:tc>
+          <w:tcPr>
+            <w:tcW w:w="1337" w:type="dxa"/>
+            <w:tcMar>
+              <w:top w:w="100" w:type="dxa"/>
+              <w:left w:w="100" w:type="dxa"/>
+              <w:bottom w:w="100" w:type="dxa"/>
+              <w:right w:w="100" w:type="dxa"/>
+            </w:tcMar>
+          </w:tcPr>
+          <w:p/>
+        </w:tc>
+        <w:tc>
+          <w:tcPr>
+            <w:tcW w:w="1337" w:type="dxa"/>
+            <w:tcMar>
+              <w:top w:w="100" w:type="dxa"/>
+              <w:left w:w="100" w:type="dxa"/>
+              <w:bottom w:w="100" w:type="dxa"/>
+              <w:right w:w="100" w:type="dxa"/>
+            </w:tcMar>
+          </w:tcPr>
+          <w:p/>
+        </w:tc>
+        <w:tc>
+          <w:tcPr>
+            <w:tcW w:w="1337" w:type="dxa"/>
+            <w:tcMar>
+              <w:top w:w="100" w:type="dxa"/>
+              <w:left w:w="100" w:type="dxa"/>
+              <w:bottom w:w="100" w:type="dxa"/>
+              <w:right w:w="100" w:type="dxa"/>
+            </w:tcMar>
+          </w:tcPr>
+          <w:p/>
+        </w:tc>
+      </w:tr>
+      <w:tr>
+        <w:tc>
+          <w:tcPr>
+            <w:tcW w:w="1337" w:type="dxa"/>
+            <w:tcMar>
+              <w:top w:w="100" w:type="dxa"/>
+              <w:left w:w="100" w:type="dxa"/>
+              <w:bottom w:w="100" w:type="dxa"/>
+              <w:right w:w="100" w:type="dxa"/>
+            </w:tcMar>
+          </w:tcPr>
           <w:p>
             <w:r>
-              <w:t>0</w:t>
-            </w:r>
-          </w:p>
-        </w:tc>
-        <w:tc>
-          <w:tcPr>
-            <w:tcW w:w="1337" w:type="dxa"/>
-            <w:tcMar>
-              <w:top w:w="100" w:type="dxa"/>
-              <w:left w:w="100" w:type="dxa"/>
-              <w:bottom w:w="100" w:type="dxa"/>
-              <w:right w:w="100" w:type="dxa"/>
-            </w:tcMar>
-          </w:tcPr>
-          <w:p>
-            <w:r>
-              <w:t>0</w:t>
-            </w:r>
-          </w:p>
-        </w:tc>
-        <w:tc>
-          <w:tcPr>
-            <w:tcW w:w="1337" w:type="dxa"/>
-            <w:tcMar>
-              <w:top w:w="100" w:type="dxa"/>
-              <w:left w:w="100" w:type="dxa"/>
-              <w:bottom w:w="100" w:type="dxa"/>
-              <w:right w:w="100" w:type="dxa"/>
-            </w:tcMar>
-          </w:tcPr>
-          <w:p>
-            <w:r>
-              <w:t>3</w:t>
-            </w:r>
-          </w:p>
-        </w:tc>
-        <w:tc>
-          <w:tcPr>
-            <w:tcW w:w="1337" w:type="dxa"/>
-            <w:tcMar>
-              <w:top w:w="100" w:type="dxa"/>
-              <w:left w:w="100" w:type="dxa"/>
-              <w:bottom w:w="100" w:type="dxa"/>
-              <w:right w:w="100" w:type="dxa"/>
-            </w:tcMar>
-          </w:tcPr>
-          <w:p>
-            <w:r>
-              <w:t>7</w:t>
-            </w:r>
-          </w:p>
-        </w:tc>
-        <w:tc>
-          <w:tcPr>
-            <w:tcW w:w="1337" w:type="dxa"/>
-            <w:tcMar>
-              <w:top w:w="100" w:type="dxa"/>
-              <w:left w:w="100" w:type="dxa"/>
-              <w:bottom w:w="100" w:type="dxa"/>
-              <w:right w:w="100" w:type="dxa"/>
-            </w:tcMar>
-          </w:tcPr>
-          <w:p>
-            <w:r>
-              <w:t>10</w:t>
-            </w:r>
-          </w:p>
-        </w:tc>
-        <w:tc>
-          <w:tcPr>
-            <w:tcW w:w="1337" w:type="dxa"/>
-            <w:tcMar>
-              <w:top w:w="100" w:type="dxa"/>
-              <w:left w:w="100" w:type="dxa"/>
-              <w:bottom w:w="100" w:type="dxa"/>
-              <w:right w:w="100" w:type="dxa"/>
-            </w:tcMar>
-          </w:tcPr>
-          <w:p>
-            <w:r>
-              <w:rPr>
-                <w:b/>
-                <w:bCs/>
-              </w:rPr>
-              <w:t>4.35</w:t>
-            </w:r>
-          </w:p>
-        </w:tc>
-      </w:tr>
-      <w:tr>
-        <w:tc>
-          <w:tcPr>
-            <w:tcW w:w="1337" w:type="dxa"/>
-            <w:tcMar>
-              <w:top w:w="100" w:type="dxa"/>
-              <w:left w:w="100" w:type="dxa"/>
-              <w:bottom w:w="100" w:type="dxa"/>
-              <w:right w:w="100" w:type="dxa"/>
-            </w:tcMar>
-          </w:tcPr>
-          <w:p>
-            <w:r>
+              <w:lastRenderedPageBreak/>
               <w:t>The system is user-friendly and requires minimal effort to learn</w:t>
             </w:r>
           </w:p>
@@ -5947,11 +6286,7 @@
               <w:right w:w="100" w:type="dxa"/>
             </w:tcMar>
           </w:tcPr>
-          <w:p>
-            <w:r>
-              <w:t>0</w:t>
-            </w:r>
-          </w:p>
+          <w:p/>
         </w:tc>
         <w:tc>
           <w:tcPr>
@@ -5963,11 +6298,7 @@
               <w:right w:w="100" w:type="dxa"/>
             </w:tcMar>
           </w:tcPr>
-          <w:p>
-            <w:r>
-              <w:t>0</w:t>
-            </w:r>
-          </w:p>
+          <w:p/>
         </w:tc>
         <w:tc>
           <w:tcPr>
@@ -5979,11 +6310,7 @@
               <w:right w:w="100" w:type="dxa"/>
             </w:tcMar>
           </w:tcPr>
-          <w:p>
-            <w:r>
-              <w:t>2</w:t>
-            </w:r>
-          </w:p>
+          <w:p/>
         </w:tc>
         <w:tc>
           <w:tcPr>
@@ -5995,11 +6322,7 @@
               <w:right w:w="100" w:type="dxa"/>
             </w:tcMar>
           </w:tcPr>
-          <w:p>
-            <w:r>
-              <w:t>10</w:t>
-            </w:r>
-          </w:p>
+          <w:p/>
         </w:tc>
         <w:tc>
           <w:tcPr>
@@ -6011,11 +6334,7 @@
               <w:right w:w="100" w:type="dxa"/>
             </w:tcMar>
           </w:tcPr>
-          <w:p>
-            <w:r>
-              <w:t>8</w:t>
-            </w:r>
-          </w:p>
+          <w:p/>
         </w:tc>
         <w:tc>
           <w:tcPr>
@@ -6027,15 +6346,7 @@
               <w:right w:w="100" w:type="dxa"/>
             </w:tcMar>
           </w:tcPr>
-          <w:p>
-            <w:r>
-              <w:rPr>
-                <w:b/>
-                <w:bCs/>
-              </w:rPr>
-              <w:t>4.3</w:t>
-            </w:r>
-          </w:p>
+          <w:p/>
         </w:tc>
       </w:tr>
     </w:tbl>
@@ -6064,8 +6375,8 @@
       <w:pPr>
         <w:pStyle w:val="Heading3"/>
       </w:pPr>
-      <w:bookmarkStart w:id="43" w:name="_574inapklbj3" w:colFirst="0" w:colLast="0"/>
-      <w:bookmarkEnd w:id="43"/>
+      <w:bookmarkStart w:id="42" w:name="_574inapklbj3" w:colFirst="0" w:colLast="0"/>
+      <w:bookmarkEnd w:id="42"/>
       <w:r>
         <w:t>User Acceptance Testing (UAT) Analysis</w:t>
       </w:r>
@@ -6309,111 +6620,82 @@
               <w:right w:w="100" w:type="dxa"/>
             </w:tcMar>
           </w:tcPr>
+          <w:p/>
+        </w:tc>
+        <w:tc>
+          <w:tcPr>
+            <w:tcW w:w="1337" w:type="dxa"/>
+            <w:tcMar>
+              <w:top w:w="100" w:type="dxa"/>
+              <w:left w:w="100" w:type="dxa"/>
+              <w:bottom w:w="100" w:type="dxa"/>
+              <w:right w:w="100" w:type="dxa"/>
+            </w:tcMar>
+          </w:tcPr>
+          <w:p/>
+        </w:tc>
+        <w:tc>
+          <w:tcPr>
+            <w:tcW w:w="1337" w:type="dxa"/>
+            <w:tcMar>
+              <w:top w:w="100" w:type="dxa"/>
+              <w:left w:w="100" w:type="dxa"/>
+              <w:bottom w:w="100" w:type="dxa"/>
+              <w:right w:w="100" w:type="dxa"/>
+            </w:tcMar>
+          </w:tcPr>
+          <w:p/>
+        </w:tc>
+        <w:tc>
+          <w:tcPr>
+            <w:tcW w:w="1337" w:type="dxa"/>
+            <w:tcMar>
+              <w:top w:w="100" w:type="dxa"/>
+              <w:left w:w="100" w:type="dxa"/>
+              <w:bottom w:w="100" w:type="dxa"/>
+              <w:right w:w="100" w:type="dxa"/>
+            </w:tcMar>
+          </w:tcPr>
+          <w:p/>
+        </w:tc>
+        <w:tc>
+          <w:tcPr>
+            <w:tcW w:w="1337" w:type="dxa"/>
+            <w:tcMar>
+              <w:top w:w="100" w:type="dxa"/>
+              <w:left w:w="100" w:type="dxa"/>
+              <w:bottom w:w="100" w:type="dxa"/>
+              <w:right w:w="100" w:type="dxa"/>
+            </w:tcMar>
+          </w:tcPr>
+          <w:p/>
+        </w:tc>
+        <w:tc>
+          <w:tcPr>
+            <w:tcW w:w="1337" w:type="dxa"/>
+            <w:tcMar>
+              <w:top w:w="100" w:type="dxa"/>
+              <w:left w:w="100" w:type="dxa"/>
+              <w:bottom w:w="100" w:type="dxa"/>
+              <w:right w:w="100" w:type="dxa"/>
+            </w:tcMar>
+          </w:tcPr>
+          <w:p/>
+        </w:tc>
+      </w:tr>
+      <w:tr>
+        <w:tc>
+          <w:tcPr>
+            <w:tcW w:w="1337" w:type="dxa"/>
+            <w:tcMar>
+              <w:top w:w="100" w:type="dxa"/>
+              <w:left w:w="100" w:type="dxa"/>
+              <w:bottom w:w="100" w:type="dxa"/>
+              <w:right w:w="100" w:type="dxa"/>
+            </w:tcMar>
+          </w:tcPr>
           <w:p>
             <w:r>
-              <w:t>0</w:t>
-            </w:r>
-          </w:p>
-        </w:tc>
-        <w:tc>
-          <w:tcPr>
-            <w:tcW w:w="1337" w:type="dxa"/>
-            <w:tcMar>
-              <w:top w:w="100" w:type="dxa"/>
-              <w:left w:w="100" w:type="dxa"/>
-              <w:bottom w:w="100" w:type="dxa"/>
-              <w:right w:w="100" w:type="dxa"/>
-            </w:tcMar>
-          </w:tcPr>
-          <w:p>
-            <w:r>
-              <w:t>0</w:t>
-            </w:r>
-          </w:p>
-        </w:tc>
-        <w:tc>
-          <w:tcPr>
-            <w:tcW w:w="1337" w:type="dxa"/>
-            <w:tcMar>
-              <w:top w:w="100" w:type="dxa"/>
-              <w:left w:w="100" w:type="dxa"/>
-              <w:bottom w:w="100" w:type="dxa"/>
-              <w:right w:w="100" w:type="dxa"/>
-            </w:tcMar>
-          </w:tcPr>
-          <w:p>
-            <w:r>
-              <w:t>1</w:t>
-            </w:r>
-          </w:p>
-        </w:tc>
-        <w:tc>
-          <w:tcPr>
-            <w:tcW w:w="1337" w:type="dxa"/>
-            <w:tcMar>
-              <w:top w:w="100" w:type="dxa"/>
-              <w:left w:w="100" w:type="dxa"/>
-              <w:bottom w:w="100" w:type="dxa"/>
-              <w:right w:w="100" w:type="dxa"/>
-            </w:tcMar>
-          </w:tcPr>
-          <w:p>
-            <w:r>
-              <w:t>10</w:t>
-            </w:r>
-          </w:p>
-        </w:tc>
-        <w:tc>
-          <w:tcPr>
-            <w:tcW w:w="1337" w:type="dxa"/>
-            <w:tcMar>
-              <w:top w:w="100" w:type="dxa"/>
-              <w:left w:w="100" w:type="dxa"/>
-              <w:bottom w:w="100" w:type="dxa"/>
-              <w:right w:w="100" w:type="dxa"/>
-            </w:tcMar>
-          </w:tcPr>
-          <w:p>
-            <w:r>
-              <w:t>9</w:t>
-            </w:r>
-          </w:p>
-        </w:tc>
-        <w:tc>
-          <w:tcPr>
-            <w:tcW w:w="1337" w:type="dxa"/>
-            <w:tcMar>
-              <w:top w:w="100" w:type="dxa"/>
-              <w:left w:w="100" w:type="dxa"/>
-              <w:bottom w:w="100" w:type="dxa"/>
-              <w:right w:w="100" w:type="dxa"/>
-            </w:tcMar>
-          </w:tcPr>
-          <w:p>
-            <w:r>
-              <w:rPr>
-                <w:b/>
-                <w:bCs/>
-              </w:rPr>
-              <w:t>4.4</w:t>
-            </w:r>
-          </w:p>
-        </w:tc>
-      </w:tr>
-      <w:tr>
-        <w:tc>
-          <w:tcPr>
-            <w:tcW w:w="1337" w:type="dxa"/>
-            <w:tcMar>
-              <w:top w:w="100" w:type="dxa"/>
-              <w:left w:w="100" w:type="dxa"/>
-              <w:bottom w:w="100" w:type="dxa"/>
-              <w:right w:w="100" w:type="dxa"/>
-            </w:tcMar>
-          </w:tcPr>
-          <w:p>
-            <w:r>
-              <w:lastRenderedPageBreak/>
               <w:t>The system is easy to navigate</w:t>
             </w:r>
           </w:p>
@@ -6428,11 +6710,7 @@
               <w:right w:w="100" w:type="dxa"/>
             </w:tcMar>
           </w:tcPr>
-          <w:p>
-            <w:r>
-              <w:t>0</w:t>
-            </w:r>
-          </w:p>
+          <w:p/>
         </w:tc>
         <w:tc>
           <w:tcPr>
@@ -6444,11 +6722,7 @@
               <w:right w:w="100" w:type="dxa"/>
             </w:tcMar>
           </w:tcPr>
-          <w:p>
-            <w:r>
-              <w:t>1</w:t>
-            </w:r>
-          </w:p>
+          <w:p/>
         </w:tc>
         <w:tc>
           <w:tcPr>
@@ -6460,11 +6734,7 @@
               <w:right w:w="100" w:type="dxa"/>
             </w:tcMar>
           </w:tcPr>
-          <w:p>
-            <w:r>
-              <w:t>2</w:t>
-            </w:r>
-          </w:p>
+          <w:p/>
         </w:tc>
         <w:tc>
           <w:tcPr>
@@ -6476,11 +6746,7 @@
               <w:right w:w="100" w:type="dxa"/>
             </w:tcMar>
           </w:tcPr>
-          <w:p>
-            <w:r>
-              <w:t>7</w:t>
-            </w:r>
-          </w:p>
+          <w:p/>
         </w:tc>
         <w:tc>
           <w:tcPr>
@@ -6492,11 +6758,7 @@
               <w:right w:w="100" w:type="dxa"/>
             </w:tcMar>
           </w:tcPr>
-          <w:p>
-            <w:r>
-              <w:t>10</w:t>
-            </w:r>
-          </w:p>
+          <w:p/>
         </w:tc>
         <w:tc>
           <w:tcPr>
@@ -6508,15 +6770,7 @@
               <w:right w:w="100" w:type="dxa"/>
             </w:tcMar>
           </w:tcPr>
-          <w:p>
-            <w:r>
-              <w:rPr>
-                <w:b/>
-                <w:bCs/>
-              </w:rPr>
-              <w:t>4.3</w:t>
-            </w:r>
-          </w:p>
+          <w:p/>
         </w:tc>
       </w:tr>
       <w:tr>
@@ -6546,11 +6800,7 @@
               <w:right w:w="100" w:type="dxa"/>
             </w:tcMar>
           </w:tcPr>
-          <w:p>
-            <w:r>
-              <w:t>0</w:t>
-            </w:r>
-          </w:p>
+          <w:p/>
         </w:tc>
         <w:tc>
           <w:tcPr>
@@ -6562,11 +6812,7 @@
               <w:right w:w="100" w:type="dxa"/>
             </w:tcMar>
           </w:tcPr>
-          <w:p>
-            <w:r>
-              <w:t>0</w:t>
-            </w:r>
-          </w:p>
+          <w:p/>
         </w:tc>
         <w:tc>
           <w:tcPr>
@@ -6578,11 +6824,7 @@
               <w:right w:w="100" w:type="dxa"/>
             </w:tcMar>
           </w:tcPr>
-          <w:p>
-            <w:r>
-              <w:t>2</w:t>
-            </w:r>
-          </w:p>
+          <w:p/>
         </w:tc>
         <w:tc>
           <w:tcPr>
@@ -6594,11 +6836,7 @@
               <w:right w:w="100" w:type="dxa"/>
             </w:tcMar>
           </w:tcPr>
-          <w:p>
-            <w:r>
-              <w:t>8</w:t>
-            </w:r>
-          </w:p>
+          <w:p/>
         </w:tc>
         <w:tc>
           <w:tcPr>
@@ -6610,11 +6848,7 @@
               <w:right w:w="100" w:type="dxa"/>
             </w:tcMar>
           </w:tcPr>
-          <w:p>
-            <w:r>
-              <w:t>10</w:t>
-            </w:r>
-          </w:p>
+          <w:p/>
         </w:tc>
         <w:tc>
           <w:tcPr>
@@ -6626,15 +6860,7 @@
               <w:right w:w="100" w:type="dxa"/>
             </w:tcMar>
           </w:tcPr>
-          <w:p>
-            <w:r>
-              <w:rPr>
-                <w:b/>
-                <w:bCs/>
-              </w:rPr>
-              <w:t>4.4</w:t>
-            </w:r>
-          </w:p>
+          <w:p/>
         </w:tc>
       </w:tr>
       <w:tr>
@@ -6664,11 +6890,7 @@
               <w:right w:w="100" w:type="dxa"/>
             </w:tcMar>
           </w:tcPr>
-          <w:p>
-            <w:r>
-              <w:t>0</w:t>
-            </w:r>
-          </w:p>
+          <w:p/>
         </w:tc>
         <w:tc>
           <w:tcPr>
@@ -6680,11 +6902,7 @@
               <w:right w:w="100" w:type="dxa"/>
             </w:tcMar>
           </w:tcPr>
-          <w:p>
-            <w:r>
-              <w:t>0</w:t>
-            </w:r>
-          </w:p>
+          <w:p/>
         </w:tc>
         <w:tc>
           <w:tcPr>
@@ -6696,11 +6914,7 @@
               <w:right w:w="100" w:type="dxa"/>
             </w:tcMar>
           </w:tcPr>
-          <w:p>
-            <w:r>
-              <w:t>1</w:t>
-            </w:r>
-          </w:p>
+          <w:p/>
         </w:tc>
         <w:tc>
           <w:tcPr>
@@ -6712,11 +6926,7 @@
               <w:right w:w="100" w:type="dxa"/>
             </w:tcMar>
           </w:tcPr>
-          <w:p>
-            <w:r>
-              <w:t>9</w:t>
-            </w:r>
-          </w:p>
+          <w:p/>
         </w:tc>
         <w:tc>
           <w:tcPr>
@@ -6728,11 +6938,7 @@
               <w:right w:w="100" w:type="dxa"/>
             </w:tcMar>
           </w:tcPr>
-          <w:p>
-            <w:r>
-              <w:t>10</w:t>
-            </w:r>
-          </w:p>
+          <w:p/>
         </w:tc>
         <w:tc>
           <w:tcPr>
@@ -6744,15 +6950,7 @@
               <w:right w:w="100" w:type="dxa"/>
             </w:tcMar>
           </w:tcPr>
-          <w:p>
-            <w:r>
-              <w:rPr>
-                <w:b/>
-                <w:bCs/>
-              </w:rPr>
-              <w:t>4.45</w:t>
-            </w:r>
-          </w:p>
+          <w:p/>
         </w:tc>
       </w:tr>
     </w:tbl>
@@ -6781,9 +6979,10 @@
       <w:pPr>
         <w:pStyle w:val="Heading2"/>
       </w:pPr>
-      <w:bookmarkStart w:id="44" w:name="_nfwhwyyjtdkm" w:colFirst="0" w:colLast="0"/>
-      <w:bookmarkEnd w:id="44"/>
-      <w:r>
+      <w:bookmarkStart w:id="43" w:name="_nfwhwyyjtdkm" w:colFirst="0" w:colLast="0"/>
+      <w:bookmarkEnd w:id="43"/>
+      <w:r>
+        <w:lastRenderedPageBreak/>
         <w:t>Discussion of Findings</w:t>
       </w:r>
     </w:p>
@@ -6866,8 +7065,7 @@
     </w:p>
     <w:p/>
     <w:sectPr>
-      <w:headerReference w:type="default" r:id="rId7"/>
-      <w:footerReference w:type="default" r:id="rId8"/>
+      <w:footerReference w:type="default" r:id="rId15"/>
       <w:pgSz w:w="12240" w:h="15840"/>
       <w:pgMar w:top="1440" w:right="1440" w:bottom="1440" w:left="1440" w:header="0" w:footer="720" w:gutter="0"/>
       <w:pgNumType w:start="1"/>
@@ -6978,83 +7176,6 @@
     </w:p>
   </w:footnote>
 </w:footnotes>
-</file>
-
-<file path=word/header1.xml><?xml version="1.0" encoding="utf-8"?>
-<w:hdr xmlns:wpc="http://schemas.microsoft.com/office/word/2010/wordprocessingCanvas" xmlns:cx="http://schemas.microsoft.com/office/drawing/2014/chartex" xmlns:cx1="http://schemas.microsoft.com/office/drawing/2015/9/8/chartex" xmlns:cx2="http://schemas.microsoft.com/office/drawing/2015/10/21/chartex" xmlns:cx3="http://schemas.microsoft.com/office/drawing/2016/5/9/chartex" xmlns:cx4="http://schemas.microsoft.com/office/drawing/2016/5/10/chartex" xmlns:cx5="http://schemas.microsoft.com/office/drawing/2016/5/11/chartex" xmlns:cx6="http://schemas.microsoft.com/office/drawing/2016/5/12/chartex" xmlns:cx7="http://schemas.microsoft.com/office/drawing/2016/5/13/chartex" xmlns:cx8="http://schemas.microsoft.com/office/drawing/2016/5/14/chartex" xmlns:mc="http://schemas.openxmlformats.org/markup-compatibility/2006" xmlns:aink="http://schemas.microsoft.com/office/drawing/2016/ink" xmlns:am3d="http://schemas.microsoft.com/office/drawing/2017/model3d" xmlns:o="urn:schemas-microsoft-com:office:office" xmlns:oel="http://schemas.microsoft.com/office/2019/extlst" xmlns:r="http://schemas.openxmlformats.org/officeDocument/2006/relationships" xmlns:m="http://schemas.openxmlformats.org/officeDocument/2006/math" xmlns:v="urn:schemas-microsoft-com:vml" xmlns:wp14="http://schemas.microsoft.com/office/word/2010/wordprocessingDrawing" xmlns:wp="http://schemas.openxmlformats.org/drawingml/2006/wordprocessingDrawing" xmlns:w10="urn:schemas-microsoft-com:office:word" xmlns:w="http://schemas.openxmlformats.org/wordprocessingml/2006/main" xmlns:w14="http://schemas.microsoft.com/office/word/2010/wordml" xmlns:w15="http://schemas.microsoft.com/office/word/2012/wordml" xmlns:w16cex="http://schemas.microsoft.com/office/word/2018/wordml/cex" xmlns:w16cid="http://schemas.microsoft.com/office/word/2016/wordml/cid" xmlns:w16="http://schemas.microsoft.com/office/word/2018/wordml" xmlns:w16du="http://schemas.microsoft.com/office/word/2023/wordml/word16du" xmlns:w16sdtdh="http://schemas.microsoft.com/office/word/2020/wordml/sdtdatahash" xmlns:w16sdtfl="http://schemas.microsoft.com/office/word/2024/wordml/sdtformatlock" xmlns:w16se="http://schemas.microsoft.com/office/word/2015/wordml/symex" xmlns:wpg="http://schemas.microsoft.com/office/word/2010/wordprocessingGroup" xmlns:wpi="http://schemas.microsoft.com/office/word/2010/wordprocessingInk" xmlns:wne="http://schemas.microsoft.com/office/word/2006/wordml" xmlns:wps="http://schemas.microsoft.com/office/word/2010/wordprocessingShape" mc:Ignorable="w14 w15 w16se w16cid w16 w16cex w16sdtdh w16sdtfl w16du wp14">
-  <w:p>
-    <w:pPr>
-      <w:pStyle w:val="Header"/>
-    </w:pPr>
-    <w:r>
-      <w:rPr>
-        <w:noProof/>
-      </w:rPr>
-      <w:drawing>
-        <wp:anchor distT="0" distB="0" distL="114300" distR="114300" simplePos="0" relativeHeight="251658240" behindDoc="0" locked="0" layoutInCell="1" allowOverlap="1" wp14:anchorId="05F52122" wp14:editId="2AA0E1C8">
-          <wp:simplePos x="0" y="0"/>
-          <wp:positionH relativeFrom="column">
-            <wp:posOffset>7620</wp:posOffset>
-          </wp:positionH>
-          <wp:positionV relativeFrom="paragraph">
-            <wp:posOffset>-11430</wp:posOffset>
-          </wp:positionV>
-          <wp:extent cx="5943600" cy="1049020"/>
-          <wp:effectExtent l="0" t="0" r="0" b="0"/>
-          <wp:wrapNone/>
-          <wp:docPr id="1611021991" name="Picture 1"/>
-          <wp:cNvGraphicFramePr>
-            <a:graphicFrameLocks xmlns:a="http://schemas.openxmlformats.org/drawingml/2006/main" noChangeAspect="1"/>
-          </wp:cNvGraphicFramePr>
-          <a:graphic xmlns:a="http://schemas.openxmlformats.org/drawingml/2006/main">
-            <a:graphicData uri="http://schemas.openxmlformats.org/drawingml/2006/picture">
-              <pic:pic xmlns:pic="http://schemas.openxmlformats.org/drawingml/2006/picture">
-                <pic:nvPicPr>
-                  <pic:cNvPr id="0" name="Picture 1"/>
-                  <pic:cNvPicPr>
-                    <a:picLocks noChangeAspect="1" noChangeArrowheads="1"/>
-                  </pic:cNvPicPr>
-                </pic:nvPicPr>
-                <pic:blipFill>
-                  <a:blip r:embed="rId1">
-                    <a:extLst>
-                      <a:ext uri="{28A0092B-C50C-407E-A947-70E740481C1C}">
-                        <a14:useLocalDpi xmlns:a14="http://schemas.microsoft.com/office/drawing/2010/main" val="0"/>
-                      </a:ext>
-                    </a:extLst>
-                  </a:blip>
-                  <a:srcRect/>
-                  <a:stretch>
-                    <a:fillRect/>
-                  </a:stretch>
-                </pic:blipFill>
-                <pic:spPr bwMode="auto">
-                  <a:xfrm>
-                    <a:off x="0" y="0"/>
-                    <a:ext cx="5943600" cy="1049020"/>
-                  </a:xfrm>
-                  <a:prstGeom prst="rect">
-                    <a:avLst/>
-                  </a:prstGeom>
-                  <a:noFill/>
-                  <a:ln>
-                    <a:noFill/>
-                  </a:ln>
-                </pic:spPr>
-              </pic:pic>
-            </a:graphicData>
-          </a:graphic>
-          <wp14:sizeRelH relativeFrom="page">
-            <wp14:pctWidth>0</wp14:pctWidth>
-          </wp14:sizeRelH>
-          <wp14:sizeRelV relativeFrom="page">
-            <wp14:pctHeight>0</wp14:pctHeight>
-          </wp14:sizeRelV>
-        </wp:anchor>
-      </w:drawing>
-    </w:r>
-  </w:p>
-</w:hdr>
 </file>
 
 <file path=word/numbering.xml><?xml version="1.0" encoding="utf-8"?>
@@ -10059,4 +10180,36 @@
   </a:objectDefaults>
   <a:extraClrSchemeLst/>
 </a:theme>
+</file>
+
+<file path=word/webextensions/taskpanes.xml><?xml version="1.0" encoding="utf-8"?>
+<wetp:taskpanes xmlns:wetp="http://schemas.microsoft.com/office/webextensions/taskpanes/2010/11">
+  <wetp:taskpane dockstate="right" visibility="0" width="350" row="1">
+    <wetp:webextensionref xmlns:r="http://schemas.openxmlformats.org/officeDocument/2006/relationships" r:id="rId1"/>
+  </wetp:taskpane>
+</wetp:taskpanes>
+</file>
+
+<file path=word/webextensions/webextension1.xml><?xml version="1.0" encoding="utf-8"?>
+<we:webextension xmlns:we="http://schemas.microsoft.com/office/webextensions/webextension/2010/11" id="{C29FF4C1-9D9A-42C8-A287-AB4339AF0797}">
+  <we:reference id="wa200000113" version="1.0.0.0" store="en-US" storeType="OMEX"/>
+  <we:alternateReferences>
+    <we:reference id="WA200000113" version="1.0.0.0" store="" storeType="OMEX"/>
+  </we:alternateReferences>
+  <we:properties/>
+  <we:bindings/>
+  <we:snapshot xmlns:r="http://schemas.openxmlformats.org/officeDocument/2006/relationships"/>
+</we:webextension>
+</file>
+
+<file path=customXml/item1.xml><?xml version="1.0" encoding="utf-8"?>
+<b:Sources xmlns:b="http://schemas.openxmlformats.org/officeDocument/2006/bibliography" xmlns="http://schemas.openxmlformats.org/officeDocument/2006/bibliography" SelectedStyle="\APASixthEditionOfficeOnline.xsl" StyleName="APA" Version="6"/>
+</file>
+
+<file path=customXml/itemProps1.xml><?xml version="1.0" encoding="utf-8"?>
+<ds:datastoreItem xmlns:ds="http://schemas.openxmlformats.org/officeDocument/2006/customXml" ds:itemID="{378CA695-408F-4BFF-82BF-19D1ADD3D591}">
+  <ds:schemaRefs>
+    <ds:schemaRef ds:uri="http://schemas.openxmlformats.org/officeDocument/2006/bibliography"/>
+  </ds:schemaRefs>
+</ds:datastoreItem>
 </file>
</xml_diff>